<commit_message>
docs: rebalance edhr design document detail
</commit_message>
<xml_diff>
--- a/doc/tasks/20260728-edhr-batch-record-design-docs/output/EDHR_Batch_Record_Outline_Design.docx
+++ b/doc/tasks/20260728-edhr-batch-record-design-docs/output/EDHR_Batch_Record_Outline_Design.docx
@@ -5425,6 +5425,4409 @@
         <w:t>需求设计、概要设计和详细设计共同构成本系统建设的成套交付资料。</w:t>
       </w:r>
     </w:p>
+    <w:p>
+      <w:pPr>
+        <w:spacing w:before="160" w:after="80"/>
+        <w:jc w:val="left"/>
+        <w:shd w:fill="1D2330"/>
+      </w:pPr>
+      <w:r>
+        <w:rPr>
+          <w:rFonts w:ascii="微软雅黑" w:hAnsi="微软雅黑" w:eastAsia="微软雅黑"/>
+          <w:b/>
+          <w:color w:val="FFFFFF"/>
+          <w:sz w:val="24"/>
+        </w:rPr>
+        <w:t>2.9 运行架构与部署视图</w:t>
+      </w:r>
+    </w:p>
+    <w:p>
+      <w:pPr>
+        <w:spacing w:after="80" w:line="276" w:lineRule="auto"/>
+      </w:pPr>
+      <w:r>
+        <w:rPr>
+          <w:rFonts w:ascii="微软雅黑" w:hAnsi="微软雅黑" w:eastAsia="微软雅黑"/>
+          <w:b w:val="0"/>
+          <w:color w:val="000000"/>
+          <w:sz w:val="21"/>
+        </w:rPr>
+        <w:t>系统采用前后端分离、业务模块分层和流程服务协同的总体架构。前端负责批记录设计、批次执行工作台、任务处理和归档查询等交互；后端负责业务规则校验、状态流转、审计留痕、数据持久化和审批协同；报表设计器、流程引擎、对象存储和权限中心作为支撑能力接入。</w:t>
+      </w:r>
+    </w:p>
+    <w:tbl>
+      <w:tblPr>
+        <w:tblStyle w:val="TableGrid"/>
+        <w:tblW w:type="auto" w:w="0"/>
+        <w:jc w:val="center"/>
+        <w:tblLook w:firstColumn="1" w:firstRow="1" w:lastColumn="0" w:lastRow="0" w:noHBand="0" w:noVBand="1" w:val="04A0"/>
+      </w:tblPr>
+      <w:tblGrid>
+        <w:gridCol w:w="2340"/>
+        <w:gridCol w:w="2340"/>
+        <w:gridCol w:w="2340"/>
+        <w:gridCol w:w="2340"/>
+      </w:tblGrid>
+      <w:tr>
+        <w:tc>
+          <w:tcPr>
+            <w:tcW w:type="dxa" w:w="1584"/>
+            <w:shd w:fill="1D2330"/>
+            <w:tcBorders>
+              <w:top w:val="single" w:sz="4" w:space="0" w:color="A6A6A6"/>
+              <w:left w:val="single" w:sz="4" w:space="0" w:color="A6A6A6"/>
+              <w:bottom w:val="single" w:sz="4" w:space="0" w:color="A6A6A6"/>
+              <w:right w:val="single" w:sz="4" w:space="0" w:color="A6A6A6"/>
+            </w:tcBorders>
+          </w:tcPr>
+          <w:p>
+            <w:pPr>
+              <w:jc w:val="center"/>
+            </w:pPr>
+            <w:r>
+              <w:rPr>
+                <w:rFonts w:ascii="微软雅黑" w:hAnsi="微软雅黑" w:eastAsia="微软雅黑"/>
+                <w:b/>
+                <w:color w:val="FFFFFF"/>
+                <w:sz w:val="20"/>
+              </w:rPr>
+              <w:t>层级</w:t>
+            </w:r>
+          </w:p>
+        </w:tc>
+        <w:tc>
+          <w:tcPr>
+            <w:tcW w:type="dxa" w:w="2880"/>
+            <w:shd w:fill="1D2330"/>
+            <w:tcBorders>
+              <w:top w:val="single" w:sz="4" w:space="0" w:color="A6A6A6"/>
+              <w:left w:val="single" w:sz="4" w:space="0" w:color="A6A6A6"/>
+              <w:bottom w:val="single" w:sz="4" w:space="0" w:color="A6A6A6"/>
+              <w:right w:val="single" w:sz="4" w:space="0" w:color="A6A6A6"/>
+            </w:tcBorders>
+          </w:tcPr>
+          <w:p>
+            <w:pPr>
+              <w:jc w:val="center"/>
+            </w:pPr>
+            <w:r>
+              <w:rPr>
+                <w:rFonts w:ascii="微软雅黑" w:hAnsi="微软雅黑" w:eastAsia="微软雅黑"/>
+                <w:b/>
+                <w:color w:val="FFFFFF"/>
+                <w:sz w:val="20"/>
+              </w:rPr>
+              <w:t>组成</w:t>
+            </w:r>
+          </w:p>
+        </w:tc>
+        <w:tc>
+          <w:tcPr>
+            <w:tcW w:type="dxa" w:w="4320"/>
+            <w:shd w:fill="1D2330"/>
+            <w:tcBorders>
+              <w:top w:val="single" w:sz="4" w:space="0" w:color="A6A6A6"/>
+              <w:left w:val="single" w:sz="4" w:space="0" w:color="A6A6A6"/>
+              <w:bottom w:val="single" w:sz="4" w:space="0" w:color="A6A6A6"/>
+              <w:right w:val="single" w:sz="4" w:space="0" w:color="A6A6A6"/>
+            </w:tcBorders>
+          </w:tcPr>
+          <w:p>
+            <w:pPr>
+              <w:jc w:val="center"/>
+            </w:pPr>
+            <w:r>
+              <w:rPr>
+                <w:rFonts w:ascii="微软雅黑" w:hAnsi="微软雅黑" w:eastAsia="微软雅黑"/>
+                <w:b/>
+                <w:color w:val="FFFFFF"/>
+                <w:sz w:val="20"/>
+              </w:rPr>
+              <w:t>职责概要</w:t>
+            </w:r>
+          </w:p>
+        </w:tc>
+        <w:tc>
+          <w:tcPr>
+            <w:tcW w:type="dxa" w:w="4320"/>
+            <w:shd w:fill="1D2330"/>
+            <w:tcBorders>
+              <w:top w:val="single" w:sz="4" w:space="0" w:color="A6A6A6"/>
+              <w:left w:val="single" w:sz="4" w:space="0" w:color="A6A6A6"/>
+              <w:bottom w:val="single" w:sz="4" w:space="0" w:color="A6A6A6"/>
+              <w:right w:val="single" w:sz="4" w:space="0" w:color="A6A6A6"/>
+            </w:tcBorders>
+          </w:tcPr>
+          <w:p>
+            <w:pPr>
+              <w:jc w:val="center"/>
+            </w:pPr>
+            <w:r>
+              <w:rPr>
+                <w:rFonts w:ascii="微软雅黑" w:hAnsi="微软雅黑" w:eastAsia="微软雅黑"/>
+                <w:b/>
+                <w:color w:val="FFFFFF"/>
+                <w:sz w:val="20"/>
+              </w:rPr>
+              <w:t>主要约束</w:t>
+            </w:r>
+          </w:p>
+        </w:tc>
+      </w:tr>
+      <w:tr>
+        <w:tc>
+          <w:tcPr>
+            <w:tcW w:type="dxa" w:w="1584"/>
+            <w:vAlign w:val="top"/>
+            <w:tcBorders>
+              <w:top w:val="single" w:sz="4" w:space="0" w:color="A6A6A6"/>
+              <w:left w:val="single" w:sz="4" w:space="0" w:color="A6A6A6"/>
+              <w:bottom w:val="single" w:sz="4" w:space="0" w:color="A6A6A6"/>
+              <w:right w:val="single" w:sz="4" w:space="0" w:color="A6A6A6"/>
+            </w:tcBorders>
+          </w:tcPr>
+          <w:p>
+            <w:pPr>
+              <w:spacing w:after="40"/>
+            </w:pPr>
+            <w:r>
+              <w:rPr>
+                <w:rFonts w:ascii="微软雅黑" w:hAnsi="微软雅黑" w:eastAsia="微软雅黑"/>
+                <w:sz w:val="19"/>
+              </w:rPr>
+              <w:t>表现层</w:t>
+            </w:r>
+          </w:p>
+        </w:tc>
+        <w:tc>
+          <w:tcPr>
+            <w:tcW w:type="dxa" w:w="2880"/>
+            <w:vAlign w:val="top"/>
+            <w:tcBorders>
+              <w:top w:val="single" w:sz="4" w:space="0" w:color="A6A6A6"/>
+              <w:left w:val="single" w:sz="4" w:space="0" w:color="A6A6A6"/>
+              <w:bottom w:val="single" w:sz="4" w:space="0" w:color="A6A6A6"/>
+              <w:right w:val="single" w:sz="4" w:space="0" w:color="A6A6A6"/>
+            </w:tcBorders>
+          </w:tcPr>
+          <w:p>
+            <w:pPr>
+              <w:spacing w:after="40"/>
+            </w:pPr>
+            <w:r>
+              <w:rPr>
+                <w:rFonts w:ascii="微软雅黑" w:hAnsi="微软雅黑" w:eastAsia="微软雅黑"/>
+                <w:sz w:val="19"/>
+              </w:rPr>
+              <w:t>EDHR 批次列表、批次详情、任务工作台、批记录填写器、批记录模板设计器</w:t>
+            </w:r>
+          </w:p>
+        </w:tc>
+        <w:tc>
+          <w:tcPr>
+            <w:tcW w:type="dxa" w:w="4320"/>
+            <w:vAlign w:val="top"/>
+            <w:tcBorders>
+              <w:top w:val="single" w:sz="4" w:space="0" w:color="A6A6A6"/>
+              <w:left w:val="single" w:sz="4" w:space="0" w:color="A6A6A6"/>
+              <w:bottom w:val="single" w:sz="4" w:space="0" w:color="A6A6A6"/>
+              <w:right w:val="single" w:sz="4" w:space="0" w:color="A6A6A6"/>
+            </w:tcBorders>
+          </w:tcPr>
+          <w:p>
+            <w:pPr>
+              <w:spacing w:after="40"/>
+            </w:pPr>
+            <w:r>
+              <w:rPr>
+                <w:rFonts w:ascii="微软雅黑" w:hAnsi="微软雅黑" w:eastAsia="微软雅黑"/>
+                <w:sz w:val="19"/>
+              </w:rPr>
+              <w:t>承载用户操作入口，提供查看、填写、签名、提交、审批、归档和追溯界面。</w:t>
+            </w:r>
+          </w:p>
+        </w:tc>
+        <w:tc>
+          <w:tcPr>
+            <w:tcW w:type="dxa" w:w="4320"/>
+            <w:vAlign w:val="top"/>
+            <w:tcBorders>
+              <w:top w:val="single" w:sz="4" w:space="0" w:color="A6A6A6"/>
+              <w:left w:val="single" w:sz="4" w:space="0" w:color="A6A6A6"/>
+              <w:bottom w:val="single" w:sz="4" w:space="0" w:color="A6A6A6"/>
+              <w:right w:val="single" w:sz="4" w:space="0" w:color="A6A6A6"/>
+            </w:tcBorders>
+          </w:tcPr>
+          <w:p>
+            <w:pPr>
+              <w:spacing w:after="40"/>
+            </w:pPr>
+            <w:r>
+              <w:rPr>
+                <w:rFonts w:ascii="微软雅黑" w:hAnsi="微软雅黑" w:eastAsia="微软雅黑"/>
+                <w:sz w:val="19"/>
+              </w:rPr>
+              <w:t>页面仅展示经后端授权和状态校验后的操作，不在前端自行推断业务终态。</w:t>
+            </w:r>
+          </w:p>
+        </w:tc>
+      </w:tr>
+      <w:tr>
+        <w:tc>
+          <w:tcPr>
+            <w:tcW w:type="dxa" w:w="1584"/>
+            <w:vAlign w:val="top"/>
+            <w:tcBorders>
+              <w:top w:val="single" w:sz="4" w:space="0" w:color="A6A6A6"/>
+              <w:left w:val="single" w:sz="4" w:space="0" w:color="A6A6A6"/>
+              <w:bottom w:val="single" w:sz="4" w:space="0" w:color="A6A6A6"/>
+              <w:right w:val="single" w:sz="4" w:space="0" w:color="A6A6A6"/>
+            </w:tcBorders>
+          </w:tcPr>
+          <w:p>
+            <w:pPr>
+              <w:spacing w:after="40"/>
+            </w:pPr>
+            <w:r>
+              <w:rPr>
+                <w:rFonts w:ascii="微软雅黑" w:hAnsi="微软雅黑" w:eastAsia="微软雅黑"/>
+                <w:sz w:val="19"/>
+              </w:rPr>
+              <w:t>接口层</w:t>
+            </w:r>
+          </w:p>
+        </w:tc>
+        <w:tc>
+          <w:tcPr>
+            <w:tcW w:type="dxa" w:w="2880"/>
+            <w:vAlign w:val="top"/>
+            <w:tcBorders>
+              <w:top w:val="single" w:sz="4" w:space="0" w:color="A6A6A6"/>
+              <w:left w:val="single" w:sz="4" w:space="0" w:color="A6A6A6"/>
+              <w:bottom w:val="single" w:sz="4" w:space="0" w:color="A6A6A6"/>
+              <w:right w:val="single" w:sz="4" w:space="0" w:color="A6A6A6"/>
+            </w:tcBorders>
+          </w:tcPr>
+          <w:p>
+            <w:pPr>
+              <w:spacing w:after="40"/>
+            </w:pPr>
+            <w:r>
+              <w:rPr>
+                <w:rFonts w:ascii="微软雅黑" w:hAnsi="微软雅黑" w:eastAsia="微软雅黑"/>
+                <w:sz w:val="19"/>
+              </w:rPr>
+              <w:t>批记录报表接口、批记录执行接口、批次执行接口、工作任务接口、变更记录接口</w:t>
+            </w:r>
+          </w:p>
+        </w:tc>
+        <w:tc>
+          <w:tcPr>
+            <w:tcW w:type="dxa" w:w="4320"/>
+            <w:vAlign w:val="top"/>
+            <w:tcBorders>
+              <w:top w:val="single" w:sz="4" w:space="0" w:color="A6A6A6"/>
+              <w:left w:val="single" w:sz="4" w:space="0" w:color="A6A6A6"/>
+              <w:bottom w:val="single" w:sz="4" w:space="0" w:color="A6A6A6"/>
+              <w:right w:val="single" w:sz="4" w:space="0" w:color="A6A6A6"/>
+            </w:tcBorders>
+          </w:tcPr>
+          <w:p>
+            <w:pPr>
+              <w:spacing w:after="40"/>
+            </w:pPr>
+            <w:r>
+              <w:rPr>
+                <w:rFonts w:ascii="微软雅黑" w:hAnsi="微软雅黑" w:eastAsia="微软雅黑"/>
+                <w:sz w:val="19"/>
+              </w:rPr>
+              <w:t>提供统一的业务入口，负责参数校验、权限校验、业务服务编排和响应模型转换。</w:t>
+            </w:r>
+          </w:p>
+        </w:tc>
+        <w:tc>
+          <w:tcPr>
+            <w:tcW w:type="dxa" w:w="4320"/>
+            <w:vAlign w:val="top"/>
+            <w:tcBorders>
+              <w:top w:val="single" w:sz="4" w:space="0" w:color="A6A6A6"/>
+              <w:left w:val="single" w:sz="4" w:space="0" w:color="A6A6A6"/>
+              <w:bottom w:val="single" w:sz="4" w:space="0" w:color="A6A6A6"/>
+              <w:right w:val="single" w:sz="4" w:space="0" w:color="A6A6A6"/>
+            </w:tcBorders>
+          </w:tcPr>
+          <w:p>
+            <w:pPr>
+              <w:spacing w:after="40"/>
+            </w:pPr>
+            <w:r>
+              <w:rPr>
+                <w:rFonts w:ascii="微软雅黑" w:hAnsi="微软雅黑" w:eastAsia="微软雅黑"/>
+                <w:sz w:val="19"/>
+              </w:rPr>
+              <w:t>接口按业务域分组，不跨域混用批记录表单、表单槽位和工序开始配置。</w:t>
+            </w:r>
+          </w:p>
+        </w:tc>
+      </w:tr>
+      <w:tr>
+        <w:tc>
+          <w:tcPr>
+            <w:tcW w:type="dxa" w:w="1584"/>
+            <w:vAlign w:val="top"/>
+            <w:tcBorders>
+              <w:top w:val="single" w:sz="4" w:space="0" w:color="A6A6A6"/>
+              <w:left w:val="single" w:sz="4" w:space="0" w:color="A6A6A6"/>
+              <w:bottom w:val="single" w:sz="4" w:space="0" w:color="A6A6A6"/>
+              <w:right w:val="single" w:sz="4" w:space="0" w:color="A6A6A6"/>
+            </w:tcBorders>
+          </w:tcPr>
+          <w:p>
+            <w:pPr>
+              <w:spacing w:after="40"/>
+            </w:pPr>
+            <w:r>
+              <w:rPr>
+                <w:rFonts w:ascii="微软雅黑" w:hAnsi="微软雅黑" w:eastAsia="微软雅黑"/>
+                <w:sz w:val="19"/>
+              </w:rPr>
+              <w:t>业务层</w:t>
+            </w:r>
+          </w:p>
+        </w:tc>
+        <w:tc>
+          <w:tcPr>
+            <w:tcW w:type="dxa" w:w="2880"/>
+            <w:vAlign w:val="top"/>
+            <w:tcBorders>
+              <w:top w:val="single" w:sz="4" w:space="0" w:color="A6A6A6"/>
+              <w:left w:val="single" w:sz="4" w:space="0" w:color="A6A6A6"/>
+              <w:bottom w:val="single" w:sz="4" w:space="0" w:color="A6A6A6"/>
+              <w:right w:val="single" w:sz="4" w:space="0" w:color="A6A6A6"/>
+            </w:tcBorders>
+          </w:tcPr>
+          <w:p>
+            <w:pPr>
+              <w:spacing w:after="40"/>
+            </w:pPr>
+            <w:r>
+              <w:rPr>
+                <w:rFonts w:ascii="微软雅黑" w:hAnsi="微软雅黑" w:eastAsia="微软雅黑"/>
+                <w:sz w:val="19"/>
+              </w:rPr>
+              <w:t>模板识别、版本治理、批次创建、任务派发、填写保存、审批协同、归档服务</w:t>
+            </w:r>
+          </w:p>
+        </w:tc>
+        <w:tc>
+          <w:tcPr>
+            <w:tcW w:type="dxa" w:w="4320"/>
+            <w:vAlign w:val="top"/>
+            <w:tcBorders>
+              <w:top w:val="single" w:sz="4" w:space="0" w:color="A6A6A6"/>
+              <w:left w:val="single" w:sz="4" w:space="0" w:color="A6A6A6"/>
+              <w:bottom w:val="single" w:sz="4" w:space="0" w:color="A6A6A6"/>
+              <w:right w:val="single" w:sz="4" w:space="0" w:color="A6A6A6"/>
+            </w:tcBorders>
+          </w:tcPr>
+          <w:p>
+            <w:pPr>
+              <w:spacing w:after="40"/>
+            </w:pPr>
+            <w:r>
+              <w:rPr>
+                <w:rFonts w:ascii="微软雅黑" w:hAnsi="微软雅黑" w:eastAsia="微软雅黑"/>
+                <w:sz w:val="19"/>
+              </w:rPr>
+              <w:t>实现业务规则、状态机、审计链、归档和异常处理。</w:t>
+            </w:r>
+          </w:p>
+        </w:tc>
+        <w:tc>
+          <w:tcPr>
+            <w:tcW w:type="dxa" w:w="4320"/>
+            <w:vAlign w:val="top"/>
+            <w:tcBorders>
+              <w:top w:val="single" w:sz="4" w:space="0" w:color="A6A6A6"/>
+              <w:left w:val="single" w:sz="4" w:space="0" w:color="A6A6A6"/>
+              <w:bottom w:val="single" w:sz="4" w:space="0" w:color="A6A6A6"/>
+              <w:right w:val="single" w:sz="4" w:space="0" w:color="A6A6A6"/>
+            </w:tcBorders>
+          </w:tcPr>
+          <w:p>
+            <w:pPr>
+              <w:spacing w:after="40"/>
+            </w:pPr>
+            <w:r>
+              <w:rPr>
+                <w:rFonts w:ascii="微软雅黑" w:hAnsi="微软雅黑" w:eastAsia="微软雅黑"/>
+                <w:sz w:val="19"/>
+              </w:rPr>
+              <w:t>终态保护、权限保护和审计记录在服务层统一执行。</w:t>
+            </w:r>
+          </w:p>
+        </w:tc>
+      </w:tr>
+      <w:tr>
+        <w:tc>
+          <w:tcPr>
+            <w:tcW w:type="dxa" w:w="1584"/>
+            <w:vAlign w:val="top"/>
+            <w:tcBorders>
+              <w:top w:val="single" w:sz="4" w:space="0" w:color="A6A6A6"/>
+              <w:left w:val="single" w:sz="4" w:space="0" w:color="A6A6A6"/>
+              <w:bottom w:val="single" w:sz="4" w:space="0" w:color="A6A6A6"/>
+              <w:right w:val="single" w:sz="4" w:space="0" w:color="A6A6A6"/>
+            </w:tcBorders>
+          </w:tcPr>
+          <w:p>
+            <w:pPr>
+              <w:spacing w:after="40"/>
+            </w:pPr>
+            <w:r>
+              <w:rPr>
+                <w:rFonts w:ascii="微软雅黑" w:hAnsi="微软雅黑" w:eastAsia="微软雅黑"/>
+                <w:sz w:val="19"/>
+              </w:rPr>
+              <w:t>数据层</w:t>
+            </w:r>
+          </w:p>
+        </w:tc>
+        <w:tc>
+          <w:tcPr>
+            <w:tcW w:type="dxa" w:w="2880"/>
+            <w:vAlign w:val="top"/>
+            <w:tcBorders>
+              <w:top w:val="single" w:sz="4" w:space="0" w:color="A6A6A6"/>
+              <w:left w:val="single" w:sz="4" w:space="0" w:color="A6A6A6"/>
+              <w:bottom w:val="single" w:sz="4" w:space="0" w:color="A6A6A6"/>
+              <w:right w:val="single" w:sz="4" w:space="0" w:color="A6A6A6"/>
+            </w:tcBorders>
+          </w:tcPr>
+          <w:p>
+            <w:pPr>
+              <w:spacing w:after="40"/>
+            </w:pPr>
+            <w:r>
+              <w:rPr>
+                <w:rFonts w:ascii="微软雅黑" w:hAnsi="微软雅黑" w:eastAsia="微软雅黑"/>
+                <w:sz w:val="19"/>
+              </w:rPr>
+              <w:t>批记录报表、批记录版本、批次执行、工作任务、字段审计、变更记录、归档记录</w:t>
+            </w:r>
+          </w:p>
+        </w:tc>
+        <w:tc>
+          <w:tcPr>
+            <w:tcW w:type="dxa" w:w="4320"/>
+            <w:vAlign w:val="top"/>
+            <w:tcBorders>
+              <w:top w:val="single" w:sz="4" w:space="0" w:color="A6A6A6"/>
+              <w:left w:val="single" w:sz="4" w:space="0" w:color="A6A6A6"/>
+              <w:bottom w:val="single" w:sz="4" w:space="0" w:color="A6A6A6"/>
+              <w:right w:val="single" w:sz="4" w:space="0" w:color="A6A6A6"/>
+            </w:tcBorders>
+          </w:tcPr>
+          <w:p>
+            <w:pPr>
+              <w:spacing w:after="40"/>
+            </w:pPr>
+            <w:r>
+              <w:rPr>
+                <w:rFonts w:ascii="微软雅黑" w:hAnsi="微软雅黑" w:eastAsia="微软雅黑"/>
+                <w:sz w:val="19"/>
+              </w:rPr>
+              <w:t>保存配置、运行态、填写结果、审计证据和交付记录。</w:t>
+            </w:r>
+          </w:p>
+        </w:tc>
+        <w:tc>
+          <w:tcPr>
+            <w:tcW w:type="dxa" w:w="4320"/>
+            <w:vAlign w:val="top"/>
+            <w:tcBorders>
+              <w:top w:val="single" w:sz="4" w:space="0" w:color="A6A6A6"/>
+              <w:left w:val="single" w:sz="4" w:space="0" w:color="A6A6A6"/>
+              <w:bottom w:val="single" w:sz="4" w:space="0" w:color="A6A6A6"/>
+              <w:right w:val="single" w:sz="4" w:space="0" w:color="A6A6A6"/>
+            </w:tcBorders>
+          </w:tcPr>
+          <w:p>
+            <w:pPr>
+              <w:spacing w:after="40"/>
+            </w:pPr>
+            <w:r>
+              <w:rPr>
+                <w:rFonts w:ascii="微软雅黑" w:hAnsi="微软雅黑" w:eastAsia="微软雅黑"/>
+                <w:sz w:val="19"/>
+              </w:rPr>
+              <w:t>重要业务记录采用状态字段和审计表配合管理，不允许绕过审计链修改核心结果。</w:t>
+            </w:r>
+          </w:p>
+        </w:tc>
+      </w:tr>
+      <w:tr>
+        <w:tc>
+          <w:tcPr>
+            <w:tcW w:type="dxa" w:w="1584"/>
+            <w:vAlign w:val="top"/>
+            <w:tcBorders>
+              <w:top w:val="single" w:sz="4" w:space="0" w:color="A6A6A6"/>
+              <w:left w:val="single" w:sz="4" w:space="0" w:color="A6A6A6"/>
+              <w:bottom w:val="single" w:sz="4" w:space="0" w:color="A6A6A6"/>
+              <w:right w:val="single" w:sz="4" w:space="0" w:color="A6A6A6"/>
+            </w:tcBorders>
+          </w:tcPr>
+          <w:p>
+            <w:pPr>
+              <w:spacing w:after="40"/>
+            </w:pPr>
+            <w:r>
+              <w:rPr>
+                <w:rFonts w:ascii="微软雅黑" w:hAnsi="微软雅黑" w:eastAsia="微软雅黑"/>
+                <w:sz w:val="19"/>
+              </w:rPr>
+              <w:t>支撑层</w:t>
+            </w:r>
+          </w:p>
+        </w:tc>
+        <w:tc>
+          <w:tcPr>
+            <w:tcW w:type="dxa" w:w="2880"/>
+            <w:vAlign w:val="top"/>
+            <w:tcBorders>
+              <w:top w:val="single" w:sz="4" w:space="0" w:color="A6A6A6"/>
+              <w:left w:val="single" w:sz="4" w:space="0" w:color="A6A6A6"/>
+              <w:bottom w:val="single" w:sz="4" w:space="0" w:color="A6A6A6"/>
+              <w:right w:val="single" w:sz="4" w:space="0" w:color="A6A6A6"/>
+            </w:tcBorders>
+          </w:tcPr>
+          <w:p>
+            <w:pPr>
+              <w:spacing w:after="40"/>
+            </w:pPr>
+            <w:r>
+              <w:rPr>
+                <w:rFonts w:ascii="微软雅黑" w:hAnsi="微软雅黑" w:eastAsia="微软雅黑"/>
+                <w:sz w:val="19"/>
+              </w:rPr>
+              <w:t>Jimu 报表、BPM 审批、系统权限、用户组织、文件存储、操作日志</w:t>
+            </w:r>
+          </w:p>
+        </w:tc>
+        <w:tc>
+          <w:tcPr>
+            <w:tcW w:type="dxa" w:w="4320"/>
+            <w:vAlign w:val="top"/>
+            <w:tcBorders>
+              <w:top w:val="single" w:sz="4" w:space="0" w:color="A6A6A6"/>
+              <w:left w:val="single" w:sz="4" w:space="0" w:color="A6A6A6"/>
+              <w:bottom w:val="single" w:sz="4" w:space="0" w:color="A6A6A6"/>
+              <w:right w:val="single" w:sz="4" w:space="0" w:color="A6A6A6"/>
+            </w:tcBorders>
+          </w:tcPr>
+          <w:p>
+            <w:pPr>
+              <w:spacing w:after="40"/>
+            </w:pPr>
+            <w:r>
+              <w:rPr>
+                <w:rFonts w:ascii="微软雅黑" w:hAnsi="微软雅黑" w:eastAsia="微软雅黑"/>
+                <w:sz w:val="19"/>
+              </w:rPr>
+              <w:t>提供报表渲染、审批流转、身份认证、附件保存和操作审计能力。</w:t>
+            </w:r>
+          </w:p>
+        </w:tc>
+        <w:tc>
+          <w:tcPr>
+            <w:tcW w:type="dxa" w:w="4320"/>
+            <w:vAlign w:val="top"/>
+            <w:tcBorders>
+              <w:top w:val="single" w:sz="4" w:space="0" w:color="A6A6A6"/>
+              <w:left w:val="single" w:sz="4" w:space="0" w:color="A6A6A6"/>
+              <w:bottom w:val="single" w:sz="4" w:space="0" w:color="A6A6A6"/>
+              <w:right w:val="single" w:sz="4" w:space="0" w:color="A6A6A6"/>
+            </w:tcBorders>
+          </w:tcPr>
+          <w:p>
+            <w:pPr>
+              <w:spacing w:after="40"/>
+            </w:pPr>
+            <w:r>
+              <w:rPr>
+                <w:rFonts w:ascii="微软雅黑" w:hAnsi="微软雅黑" w:eastAsia="微软雅黑"/>
+                <w:sz w:val="19"/>
+              </w:rPr>
+              <w:t>支撑能力异常应明确提示并阻断受影响业务操作。</w:t>
+            </w:r>
+          </w:p>
+        </w:tc>
+      </w:tr>
+    </w:tbl>
+    <w:p/>
+    <w:p>
+      <w:pPr>
+        <w:spacing w:before="160" w:after="80"/>
+        <w:jc w:val="left"/>
+        <w:shd w:fill="1D2330"/>
+      </w:pPr>
+      <w:r>
+        <w:rPr>
+          <w:rFonts w:ascii="微软雅黑" w:hAnsi="微软雅黑" w:eastAsia="微软雅黑"/>
+          <w:b/>
+          <w:color w:val="FFFFFF"/>
+          <w:sz w:val="24"/>
+        </w:rPr>
+        <w:t>2.10 模块协作关系</w:t>
+      </w:r>
+    </w:p>
+    <w:p>
+      <w:pPr>
+        <w:spacing w:after="80" w:line="276" w:lineRule="auto"/>
+      </w:pPr>
+      <w:r>
+        <w:rPr>
+          <w:rFonts w:ascii="微软雅黑" w:hAnsi="微软雅黑" w:eastAsia="微软雅黑"/>
+          <w:b w:val="0"/>
+          <w:color w:val="000000"/>
+          <w:sz w:val="21"/>
+        </w:rPr>
+        <w:t>概要设计层面将 EDHR 批记录系统划分为模板配置、路线绑定、批次执行、工作任务、填写审计、质量闭环和归档追溯七个核心协作域。各协作域之间通过明确的业务对象传递，不使用隐含字段或默认分类替代正式配置。</w:t>
+      </w:r>
+    </w:p>
+    <w:tbl>
+      <w:tblPr>
+        <w:tblStyle w:val="TableGrid"/>
+        <w:tblW w:type="auto" w:w="0"/>
+        <w:jc w:val="center"/>
+        <w:tblLook w:firstColumn="1" w:firstRow="1" w:lastColumn="0" w:lastRow="0" w:noHBand="0" w:noVBand="1" w:val="04A0"/>
+      </w:tblPr>
+      <w:tblGrid>
+        <w:gridCol w:w="1872"/>
+        <w:gridCol w:w="1872"/>
+        <w:gridCol w:w="1872"/>
+        <w:gridCol w:w="1872"/>
+        <w:gridCol w:w="1872"/>
+      </w:tblGrid>
+      <w:tr>
+        <w:tc>
+          <w:tcPr>
+            <w:tcW w:type="dxa" w:w="1872"/>
+            <w:shd w:fill="1D2330"/>
+            <w:tcBorders>
+              <w:top w:val="single" w:sz="4" w:space="0" w:color="A6A6A6"/>
+              <w:left w:val="single" w:sz="4" w:space="0" w:color="A6A6A6"/>
+              <w:bottom w:val="single" w:sz="4" w:space="0" w:color="A6A6A6"/>
+              <w:right w:val="single" w:sz="4" w:space="0" w:color="A6A6A6"/>
+            </w:tcBorders>
+          </w:tcPr>
+          <w:p>
+            <w:pPr>
+              <w:jc w:val="center"/>
+            </w:pPr>
+            <w:r>
+              <w:rPr>
+                <w:rFonts w:ascii="微软雅黑" w:hAnsi="微软雅黑" w:eastAsia="微软雅黑"/>
+                <w:b/>
+                <w:color w:val="FFFFFF"/>
+                <w:sz w:val="20"/>
+              </w:rPr>
+              <w:t>协作场景</w:t>
+            </w:r>
+          </w:p>
+        </w:tc>
+        <w:tc>
+          <w:tcPr>
+            <w:tcW w:type="dxa" w:w="2160"/>
+            <w:shd w:fill="1D2330"/>
+            <w:tcBorders>
+              <w:top w:val="single" w:sz="4" w:space="0" w:color="A6A6A6"/>
+              <w:left w:val="single" w:sz="4" w:space="0" w:color="A6A6A6"/>
+              <w:bottom w:val="single" w:sz="4" w:space="0" w:color="A6A6A6"/>
+              <w:right w:val="single" w:sz="4" w:space="0" w:color="A6A6A6"/>
+            </w:tcBorders>
+          </w:tcPr>
+          <w:p>
+            <w:pPr>
+              <w:jc w:val="center"/>
+            </w:pPr>
+            <w:r>
+              <w:rPr>
+                <w:rFonts w:ascii="微软雅黑" w:hAnsi="微软雅黑" w:eastAsia="微软雅黑"/>
+                <w:b/>
+                <w:color w:val="FFFFFF"/>
+                <w:sz w:val="20"/>
+              </w:rPr>
+              <w:t>上游模块</w:t>
+            </w:r>
+          </w:p>
+        </w:tc>
+        <w:tc>
+          <w:tcPr>
+            <w:tcW w:type="dxa" w:w="2448"/>
+            <w:shd w:fill="1D2330"/>
+            <w:tcBorders>
+              <w:top w:val="single" w:sz="4" w:space="0" w:color="A6A6A6"/>
+              <w:left w:val="single" w:sz="4" w:space="0" w:color="A6A6A6"/>
+              <w:bottom w:val="single" w:sz="4" w:space="0" w:color="A6A6A6"/>
+              <w:right w:val="single" w:sz="4" w:space="0" w:color="A6A6A6"/>
+            </w:tcBorders>
+          </w:tcPr>
+          <w:p>
+            <w:pPr>
+              <w:jc w:val="center"/>
+            </w:pPr>
+            <w:r>
+              <w:rPr>
+                <w:rFonts w:ascii="微软雅黑" w:hAnsi="微软雅黑" w:eastAsia="微软雅黑"/>
+                <w:b/>
+                <w:color w:val="FFFFFF"/>
+                <w:sz w:val="20"/>
+              </w:rPr>
+              <w:t>下游模块</w:t>
+            </w:r>
+          </w:p>
+        </w:tc>
+        <w:tc>
+          <w:tcPr>
+            <w:tcW w:type="dxa" w:w="3744"/>
+            <w:shd w:fill="1D2330"/>
+            <w:tcBorders>
+              <w:top w:val="single" w:sz="4" w:space="0" w:color="A6A6A6"/>
+              <w:left w:val="single" w:sz="4" w:space="0" w:color="A6A6A6"/>
+              <w:bottom w:val="single" w:sz="4" w:space="0" w:color="A6A6A6"/>
+              <w:right w:val="single" w:sz="4" w:space="0" w:color="A6A6A6"/>
+            </w:tcBorders>
+          </w:tcPr>
+          <w:p>
+            <w:pPr>
+              <w:jc w:val="center"/>
+            </w:pPr>
+            <w:r>
+              <w:rPr>
+                <w:rFonts w:ascii="微软雅黑" w:hAnsi="微软雅黑" w:eastAsia="微软雅黑"/>
+                <w:b/>
+                <w:color w:val="FFFFFF"/>
+                <w:sz w:val="20"/>
+              </w:rPr>
+              <w:t>交互对象</w:t>
+            </w:r>
+          </w:p>
+        </w:tc>
+        <w:tc>
+          <w:tcPr>
+            <w:tcW w:type="dxa" w:w="4032"/>
+            <w:shd w:fill="1D2330"/>
+            <w:tcBorders>
+              <w:top w:val="single" w:sz="4" w:space="0" w:color="A6A6A6"/>
+              <w:left w:val="single" w:sz="4" w:space="0" w:color="A6A6A6"/>
+              <w:bottom w:val="single" w:sz="4" w:space="0" w:color="A6A6A6"/>
+              <w:right w:val="single" w:sz="4" w:space="0" w:color="A6A6A6"/>
+            </w:tcBorders>
+          </w:tcPr>
+          <w:p>
+            <w:pPr>
+              <w:jc w:val="center"/>
+            </w:pPr>
+            <w:r>
+              <w:rPr>
+                <w:rFonts w:ascii="微软雅黑" w:hAnsi="微软雅黑" w:eastAsia="微软雅黑"/>
+                <w:b/>
+                <w:color w:val="FFFFFF"/>
+                <w:sz w:val="20"/>
+              </w:rPr>
+              <w:t>概要约束</w:t>
+            </w:r>
+          </w:p>
+        </w:tc>
+      </w:tr>
+      <w:tr>
+        <w:tc>
+          <w:tcPr>
+            <w:tcW w:type="dxa" w:w="1872"/>
+            <w:vAlign w:val="top"/>
+            <w:tcBorders>
+              <w:top w:val="single" w:sz="4" w:space="0" w:color="A6A6A6"/>
+              <w:left w:val="single" w:sz="4" w:space="0" w:color="A6A6A6"/>
+              <w:bottom w:val="single" w:sz="4" w:space="0" w:color="A6A6A6"/>
+              <w:right w:val="single" w:sz="4" w:space="0" w:color="A6A6A6"/>
+            </w:tcBorders>
+          </w:tcPr>
+          <w:p>
+            <w:pPr>
+              <w:spacing w:after="40"/>
+            </w:pPr>
+            <w:r>
+              <w:rPr>
+                <w:rFonts w:ascii="微软雅黑" w:hAnsi="微软雅黑" w:eastAsia="微软雅黑"/>
+                <w:sz w:val="19"/>
+              </w:rPr>
+              <w:t>批记录模板发布</w:t>
+            </w:r>
+          </w:p>
+        </w:tc>
+        <w:tc>
+          <w:tcPr>
+            <w:tcW w:type="dxa" w:w="2160"/>
+            <w:vAlign w:val="top"/>
+            <w:tcBorders>
+              <w:top w:val="single" w:sz="4" w:space="0" w:color="A6A6A6"/>
+              <w:left w:val="single" w:sz="4" w:space="0" w:color="A6A6A6"/>
+              <w:bottom w:val="single" w:sz="4" w:space="0" w:color="A6A6A6"/>
+              <w:right w:val="single" w:sz="4" w:space="0" w:color="A6A6A6"/>
+            </w:tcBorders>
+          </w:tcPr>
+          <w:p>
+            <w:pPr>
+              <w:spacing w:after="40"/>
+            </w:pPr>
+            <w:r>
+              <w:rPr>
+                <w:rFonts w:ascii="微软雅黑" w:hAnsi="微软雅黑" w:eastAsia="微软雅黑"/>
+                <w:sz w:val="19"/>
+              </w:rPr>
+              <w:t>批记录模板配置</w:t>
+            </w:r>
+          </w:p>
+        </w:tc>
+        <w:tc>
+          <w:tcPr>
+            <w:tcW w:type="dxa" w:w="2448"/>
+            <w:vAlign w:val="top"/>
+            <w:tcBorders>
+              <w:top w:val="single" w:sz="4" w:space="0" w:color="A6A6A6"/>
+              <w:left w:val="single" w:sz="4" w:space="0" w:color="A6A6A6"/>
+              <w:bottom w:val="single" w:sz="4" w:space="0" w:color="A6A6A6"/>
+              <w:right w:val="single" w:sz="4" w:space="0" w:color="A6A6A6"/>
+            </w:tcBorders>
+          </w:tcPr>
+          <w:p>
+            <w:pPr>
+              <w:spacing w:after="40"/>
+            </w:pPr>
+            <w:r>
+              <w:rPr>
+                <w:rFonts w:ascii="微软雅黑" w:hAnsi="微软雅黑" w:eastAsia="微软雅黑"/>
+                <w:sz w:val="19"/>
+              </w:rPr>
+              <w:t>版本治理、工艺路线绑定</w:t>
+            </w:r>
+          </w:p>
+        </w:tc>
+        <w:tc>
+          <w:tcPr>
+            <w:tcW w:type="dxa" w:w="3744"/>
+            <w:vAlign w:val="top"/>
+            <w:tcBorders>
+              <w:top w:val="single" w:sz="4" w:space="0" w:color="A6A6A6"/>
+              <w:left w:val="single" w:sz="4" w:space="0" w:color="A6A6A6"/>
+              <w:bottom w:val="single" w:sz="4" w:space="0" w:color="A6A6A6"/>
+              <w:right w:val="single" w:sz="4" w:space="0" w:color="A6A6A6"/>
+            </w:tcBorders>
+          </w:tcPr>
+          <w:p>
+            <w:pPr>
+              <w:spacing w:after="40"/>
+            </w:pPr>
+            <w:r>
+              <w:rPr>
+                <w:rFonts w:ascii="微软雅黑" w:hAnsi="微软雅黑" w:eastAsia="微软雅黑"/>
+                <w:sz w:val="19"/>
+              </w:rPr>
+              <w:t>批记录报表、版本状态、签名单元格、填写规则</w:t>
+            </w:r>
+          </w:p>
+        </w:tc>
+        <w:tc>
+          <w:tcPr>
+            <w:tcW w:type="dxa" w:w="4032"/>
+            <w:vAlign w:val="top"/>
+            <w:tcBorders>
+              <w:top w:val="single" w:sz="4" w:space="0" w:color="A6A6A6"/>
+              <w:left w:val="single" w:sz="4" w:space="0" w:color="A6A6A6"/>
+              <w:bottom w:val="single" w:sz="4" w:space="0" w:color="A6A6A6"/>
+              <w:right w:val="single" w:sz="4" w:space="0" w:color="A6A6A6"/>
+            </w:tcBorders>
+          </w:tcPr>
+          <w:p>
+            <w:pPr>
+              <w:spacing w:after="40"/>
+            </w:pPr>
+            <w:r>
+              <w:rPr>
+                <w:rFonts w:ascii="微软雅黑" w:hAnsi="微软雅黑" w:eastAsia="微软雅黑"/>
+                <w:sz w:val="19"/>
+              </w:rPr>
+              <w:t>模板必须完成规则确认后才能进入正式绑定。</w:t>
+            </w:r>
+          </w:p>
+        </w:tc>
+      </w:tr>
+      <w:tr>
+        <w:tc>
+          <w:tcPr>
+            <w:tcW w:type="dxa" w:w="1872"/>
+            <w:vAlign w:val="top"/>
+            <w:tcBorders>
+              <w:top w:val="single" w:sz="4" w:space="0" w:color="A6A6A6"/>
+              <w:left w:val="single" w:sz="4" w:space="0" w:color="A6A6A6"/>
+              <w:bottom w:val="single" w:sz="4" w:space="0" w:color="A6A6A6"/>
+              <w:right w:val="single" w:sz="4" w:space="0" w:color="A6A6A6"/>
+            </w:tcBorders>
+          </w:tcPr>
+          <w:p>
+            <w:pPr>
+              <w:spacing w:after="40"/>
+            </w:pPr>
+            <w:r>
+              <w:rPr>
+                <w:rFonts w:ascii="微软雅黑" w:hAnsi="微软雅黑" w:eastAsia="微软雅黑"/>
+                <w:sz w:val="19"/>
+              </w:rPr>
+              <w:t>路线绑定发布</w:t>
+            </w:r>
+          </w:p>
+        </w:tc>
+        <w:tc>
+          <w:tcPr>
+            <w:tcW w:type="dxa" w:w="2160"/>
+            <w:vAlign w:val="top"/>
+            <w:tcBorders>
+              <w:top w:val="single" w:sz="4" w:space="0" w:color="A6A6A6"/>
+              <w:left w:val="single" w:sz="4" w:space="0" w:color="A6A6A6"/>
+              <w:bottom w:val="single" w:sz="4" w:space="0" w:color="A6A6A6"/>
+              <w:right w:val="single" w:sz="4" w:space="0" w:color="A6A6A6"/>
+            </w:tcBorders>
+          </w:tcPr>
+          <w:p>
+            <w:pPr>
+              <w:spacing w:after="40"/>
+            </w:pPr>
+            <w:r>
+              <w:rPr>
+                <w:rFonts w:ascii="微软雅黑" w:hAnsi="微软雅黑" w:eastAsia="微软雅黑"/>
+                <w:sz w:val="19"/>
+              </w:rPr>
+              <w:t>工艺路线配置</w:t>
+            </w:r>
+          </w:p>
+        </w:tc>
+        <w:tc>
+          <w:tcPr>
+            <w:tcW w:type="dxa" w:w="2448"/>
+            <w:vAlign w:val="top"/>
+            <w:tcBorders>
+              <w:top w:val="single" w:sz="4" w:space="0" w:color="A6A6A6"/>
+              <w:left w:val="single" w:sz="4" w:space="0" w:color="A6A6A6"/>
+              <w:bottom w:val="single" w:sz="4" w:space="0" w:color="A6A6A6"/>
+              <w:right w:val="single" w:sz="4" w:space="0" w:color="A6A6A6"/>
+            </w:tcBorders>
+          </w:tcPr>
+          <w:p>
+            <w:pPr>
+              <w:spacing w:after="40"/>
+            </w:pPr>
+            <w:r>
+              <w:rPr>
+                <w:rFonts w:ascii="微软雅黑" w:hAnsi="微软雅黑" w:eastAsia="微软雅黑"/>
+                <w:sz w:val="19"/>
+              </w:rPr>
+              <w:t>批次执行创建、任务生成</w:t>
+            </w:r>
+          </w:p>
+        </w:tc>
+        <w:tc>
+          <w:tcPr>
+            <w:tcW w:type="dxa" w:w="3744"/>
+            <w:vAlign w:val="top"/>
+            <w:tcBorders>
+              <w:top w:val="single" w:sz="4" w:space="0" w:color="A6A6A6"/>
+              <w:left w:val="single" w:sz="4" w:space="0" w:color="A6A6A6"/>
+              <w:bottom w:val="single" w:sz="4" w:space="0" w:color="A6A6A6"/>
+              <w:right w:val="single" w:sz="4" w:space="0" w:color="A6A6A6"/>
+            </w:tcBorders>
+          </w:tcPr>
+          <w:p>
+            <w:pPr>
+              <w:spacing w:after="40"/>
+            </w:pPr>
+            <w:r>
+              <w:rPr>
+                <w:rFonts w:ascii="微软雅黑" w:hAnsi="微软雅黑" w:eastAsia="微软雅黑"/>
+                <w:sz w:val="19"/>
+              </w:rPr>
+              <w:t>逐工序批记录表单、表单槽位、工序开始配置</w:t>
+            </w:r>
+          </w:p>
+        </w:tc>
+        <w:tc>
+          <w:tcPr>
+            <w:tcW w:type="dxa" w:w="4032"/>
+            <w:vAlign w:val="top"/>
+            <w:tcBorders>
+              <w:top w:val="single" w:sz="4" w:space="0" w:color="A6A6A6"/>
+              <w:left w:val="single" w:sz="4" w:space="0" w:color="A6A6A6"/>
+              <w:bottom w:val="single" w:sz="4" w:space="0" w:color="A6A6A6"/>
+              <w:right w:val="single" w:sz="4" w:space="0" w:color="A6A6A6"/>
+            </w:tcBorders>
+          </w:tcPr>
+          <w:p>
+            <w:pPr>
+              <w:spacing w:after="40"/>
+            </w:pPr>
+            <w:r>
+              <w:rPr>
+                <w:rFonts w:ascii="微软雅黑" w:hAnsi="微软雅黑" w:eastAsia="微软雅黑"/>
+                <w:sz w:val="19"/>
+              </w:rPr>
+              <w:t>三类配置独立保存、独立展示、独立校验。</w:t>
+            </w:r>
+          </w:p>
+        </w:tc>
+      </w:tr>
+      <w:tr>
+        <w:tc>
+          <w:tcPr>
+            <w:tcW w:type="dxa" w:w="1872"/>
+            <w:vAlign w:val="top"/>
+            <w:tcBorders>
+              <w:top w:val="single" w:sz="4" w:space="0" w:color="A6A6A6"/>
+              <w:left w:val="single" w:sz="4" w:space="0" w:color="A6A6A6"/>
+              <w:bottom w:val="single" w:sz="4" w:space="0" w:color="A6A6A6"/>
+              <w:right w:val="single" w:sz="4" w:space="0" w:color="A6A6A6"/>
+            </w:tcBorders>
+          </w:tcPr>
+          <w:p>
+            <w:pPr>
+              <w:spacing w:after="40"/>
+            </w:pPr>
+            <w:r>
+              <w:rPr>
+                <w:rFonts w:ascii="微软雅黑" w:hAnsi="微软雅黑" w:eastAsia="微软雅黑"/>
+                <w:sz w:val="19"/>
+              </w:rPr>
+              <w:t>批次执行创建</w:t>
+            </w:r>
+          </w:p>
+        </w:tc>
+        <w:tc>
+          <w:tcPr>
+            <w:tcW w:type="dxa" w:w="2160"/>
+            <w:vAlign w:val="top"/>
+            <w:tcBorders>
+              <w:top w:val="single" w:sz="4" w:space="0" w:color="A6A6A6"/>
+              <w:left w:val="single" w:sz="4" w:space="0" w:color="A6A6A6"/>
+              <w:bottom w:val="single" w:sz="4" w:space="0" w:color="A6A6A6"/>
+              <w:right w:val="single" w:sz="4" w:space="0" w:color="A6A6A6"/>
+            </w:tcBorders>
+          </w:tcPr>
+          <w:p>
+            <w:pPr>
+              <w:spacing w:after="40"/>
+            </w:pPr>
+            <w:r>
+              <w:rPr>
+                <w:rFonts w:ascii="微软雅黑" w:hAnsi="微软雅黑" w:eastAsia="微软雅黑"/>
+                <w:sz w:val="19"/>
+              </w:rPr>
+              <w:t>生产工单、工艺路线</w:t>
+            </w:r>
+          </w:p>
+        </w:tc>
+        <w:tc>
+          <w:tcPr>
+            <w:tcW w:type="dxa" w:w="2448"/>
+            <w:vAlign w:val="top"/>
+            <w:tcBorders>
+              <w:top w:val="single" w:sz="4" w:space="0" w:color="A6A6A6"/>
+              <w:left w:val="single" w:sz="4" w:space="0" w:color="A6A6A6"/>
+              <w:bottom w:val="single" w:sz="4" w:space="0" w:color="A6A6A6"/>
+              <w:right w:val="single" w:sz="4" w:space="0" w:color="A6A6A6"/>
+            </w:tcBorders>
+          </w:tcPr>
+          <w:p>
+            <w:pPr>
+              <w:spacing w:after="40"/>
+            </w:pPr>
+            <w:r>
+              <w:rPr>
+                <w:rFonts w:ascii="微软雅黑" w:hAnsi="微软雅黑" w:eastAsia="微软雅黑"/>
+                <w:sz w:val="19"/>
+              </w:rPr>
+              <w:t>批次执行、工作任务</w:t>
+            </w:r>
+          </w:p>
+        </w:tc>
+        <w:tc>
+          <w:tcPr>
+            <w:tcW w:type="dxa" w:w="3744"/>
+            <w:vAlign w:val="top"/>
+            <w:tcBorders>
+              <w:top w:val="single" w:sz="4" w:space="0" w:color="A6A6A6"/>
+              <w:left w:val="single" w:sz="4" w:space="0" w:color="A6A6A6"/>
+              <w:bottom w:val="single" w:sz="4" w:space="0" w:color="A6A6A6"/>
+              <w:right w:val="single" w:sz="4" w:space="0" w:color="A6A6A6"/>
+            </w:tcBorders>
+          </w:tcPr>
+          <w:p>
+            <w:pPr>
+              <w:spacing w:after="40"/>
+            </w:pPr>
+            <w:r>
+              <w:rPr>
+                <w:rFonts w:ascii="微软雅黑" w:hAnsi="微软雅黑" w:eastAsia="微软雅黑"/>
+                <w:sz w:val="19"/>
+              </w:rPr>
+              <w:t>批次执行记录、任务列表、绑定快照</w:t>
+            </w:r>
+          </w:p>
+        </w:tc>
+        <w:tc>
+          <w:tcPr>
+            <w:tcW w:type="dxa" w:w="4032"/>
+            <w:vAlign w:val="top"/>
+            <w:tcBorders>
+              <w:top w:val="single" w:sz="4" w:space="0" w:color="A6A6A6"/>
+              <w:left w:val="single" w:sz="4" w:space="0" w:color="A6A6A6"/>
+              <w:bottom w:val="single" w:sz="4" w:space="0" w:color="A6A6A6"/>
+              <w:right w:val="single" w:sz="4" w:space="0" w:color="A6A6A6"/>
+            </w:tcBorders>
+          </w:tcPr>
+          <w:p>
+            <w:pPr>
+              <w:spacing w:after="40"/>
+            </w:pPr>
+            <w:r>
+              <w:rPr>
+                <w:rFonts w:ascii="微软雅黑" w:hAnsi="微软雅黑" w:eastAsia="微软雅黑"/>
+                <w:sz w:val="19"/>
+              </w:rPr>
+              <w:t>创建时冻结必要快照，确保执行期配置稳定。</w:t>
+            </w:r>
+          </w:p>
+        </w:tc>
+      </w:tr>
+      <w:tr>
+        <w:tc>
+          <w:tcPr>
+            <w:tcW w:type="dxa" w:w="1872"/>
+            <w:vAlign w:val="top"/>
+            <w:tcBorders>
+              <w:top w:val="single" w:sz="4" w:space="0" w:color="A6A6A6"/>
+              <w:left w:val="single" w:sz="4" w:space="0" w:color="A6A6A6"/>
+              <w:bottom w:val="single" w:sz="4" w:space="0" w:color="A6A6A6"/>
+              <w:right w:val="single" w:sz="4" w:space="0" w:color="A6A6A6"/>
+            </w:tcBorders>
+          </w:tcPr>
+          <w:p>
+            <w:pPr>
+              <w:spacing w:after="40"/>
+            </w:pPr>
+            <w:r>
+              <w:rPr>
+                <w:rFonts w:ascii="微软雅黑" w:hAnsi="微软雅黑" w:eastAsia="微软雅黑"/>
+                <w:sz w:val="19"/>
+              </w:rPr>
+              <w:t>任务打开填写</w:t>
+            </w:r>
+          </w:p>
+        </w:tc>
+        <w:tc>
+          <w:tcPr>
+            <w:tcW w:type="dxa" w:w="2160"/>
+            <w:vAlign w:val="top"/>
+            <w:tcBorders>
+              <w:top w:val="single" w:sz="4" w:space="0" w:color="A6A6A6"/>
+              <w:left w:val="single" w:sz="4" w:space="0" w:color="A6A6A6"/>
+              <w:bottom w:val="single" w:sz="4" w:space="0" w:color="A6A6A6"/>
+              <w:right w:val="single" w:sz="4" w:space="0" w:color="A6A6A6"/>
+            </w:tcBorders>
+          </w:tcPr>
+          <w:p>
+            <w:pPr>
+              <w:spacing w:after="40"/>
+            </w:pPr>
+            <w:r>
+              <w:rPr>
+                <w:rFonts w:ascii="微软雅黑" w:hAnsi="微软雅黑" w:eastAsia="微软雅黑"/>
+                <w:sz w:val="19"/>
+              </w:rPr>
+              <w:t>工作任务</w:t>
+            </w:r>
+          </w:p>
+        </w:tc>
+        <w:tc>
+          <w:tcPr>
+            <w:tcW w:type="dxa" w:w="2448"/>
+            <w:vAlign w:val="top"/>
+            <w:tcBorders>
+              <w:top w:val="single" w:sz="4" w:space="0" w:color="A6A6A6"/>
+              <w:left w:val="single" w:sz="4" w:space="0" w:color="A6A6A6"/>
+              <w:bottom w:val="single" w:sz="4" w:space="0" w:color="A6A6A6"/>
+              <w:right w:val="single" w:sz="4" w:space="0" w:color="A6A6A6"/>
+            </w:tcBorders>
+          </w:tcPr>
+          <w:p>
+            <w:pPr>
+              <w:spacing w:after="40"/>
+            </w:pPr>
+            <w:r>
+              <w:rPr>
+                <w:rFonts w:ascii="微软雅黑" w:hAnsi="微软雅黑" w:eastAsia="微软雅黑"/>
+                <w:sz w:val="19"/>
+              </w:rPr>
+              <w:t>批记录执行、填写器</w:t>
+            </w:r>
+          </w:p>
+        </w:tc>
+        <w:tc>
+          <w:tcPr>
+            <w:tcW w:type="dxa" w:w="3744"/>
+            <w:vAlign w:val="top"/>
+            <w:tcBorders>
+              <w:top w:val="single" w:sz="4" w:space="0" w:color="A6A6A6"/>
+              <w:left w:val="single" w:sz="4" w:space="0" w:color="A6A6A6"/>
+              <w:bottom w:val="single" w:sz="4" w:space="0" w:color="A6A6A6"/>
+              <w:right w:val="single" w:sz="4" w:space="0" w:color="A6A6A6"/>
+            </w:tcBorders>
+          </w:tcPr>
+          <w:p>
+            <w:pPr>
+              <w:spacing w:after="40"/>
+            </w:pPr>
+            <w:r>
+              <w:rPr>
+                <w:rFonts w:ascii="微软雅黑" w:hAnsi="微软雅黑" w:eastAsia="微软雅黑"/>
+                <w:sz w:val="19"/>
+              </w:rPr>
+              <w:t>任务身份、执行记录、单元格值、签名信息</w:t>
+            </w:r>
+          </w:p>
+        </w:tc>
+        <w:tc>
+          <w:tcPr>
+            <w:tcW w:type="dxa" w:w="4032"/>
+            <w:vAlign w:val="top"/>
+            <w:tcBorders>
+              <w:top w:val="single" w:sz="4" w:space="0" w:color="A6A6A6"/>
+              <w:left w:val="single" w:sz="4" w:space="0" w:color="A6A6A6"/>
+              <w:bottom w:val="single" w:sz="4" w:space="0" w:color="A6A6A6"/>
+              <w:right w:val="single" w:sz="4" w:space="0" w:color="A6A6A6"/>
+            </w:tcBorders>
+          </w:tcPr>
+          <w:p>
+            <w:pPr>
+              <w:spacing w:after="40"/>
+            </w:pPr>
+            <w:r>
+              <w:rPr>
+                <w:rFonts w:ascii="微软雅黑" w:hAnsi="微软雅黑" w:eastAsia="微软雅黑"/>
+                <w:sz w:val="19"/>
+              </w:rPr>
+              <w:t>打开前校验批次状态、任务责任、填写权限和当前活动记录。</w:t>
+            </w:r>
+          </w:p>
+        </w:tc>
+      </w:tr>
+      <w:tr>
+        <w:tc>
+          <w:tcPr>
+            <w:tcW w:type="dxa" w:w="1872"/>
+            <w:vAlign w:val="top"/>
+            <w:tcBorders>
+              <w:top w:val="single" w:sz="4" w:space="0" w:color="A6A6A6"/>
+              <w:left w:val="single" w:sz="4" w:space="0" w:color="A6A6A6"/>
+              <w:bottom w:val="single" w:sz="4" w:space="0" w:color="A6A6A6"/>
+              <w:right w:val="single" w:sz="4" w:space="0" w:color="A6A6A6"/>
+            </w:tcBorders>
+          </w:tcPr>
+          <w:p>
+            <w:pPr>
+              <w:spacing w:after="40"/>
+            </w:pPr>
+            <w:r>
+              <w:rPr>
+                <w:rFonts w:ascii="微软雅黑" w:hAnsi="微软雅黑" w:eastAsia="微软雅黑"/>
+                <w:sz w:val="19"/>
+              </w:rPr>
+              <w:t>填写提交审核</w:t>
+            </w:r>
+          </w:p>
+        </w:tc>
+        <w:tc>
+          <w:tcPr>
+            <w:tcW w:type="dxa" w:w="2160"/>
+            <w:vAlign w:val="top"/>
+            <w:tcBorders>
+              <w:top w:val="single" w:sz="4" w:space="0" w:color="A6A6A6"/>
+              <w:left w:val="single" w:sz="4" w:space="0" w:color="A6A6A6"/>
+              <w:bottom w:val="single" w:sz="4" w:space="0" w:color="A6A6A6"/>
+              <w:right w:val="single" w:sz="4" w:space="0" w:color="A6A6A6"/>
+            </w:tcBorders>
+          </w:tcPr>
+          <w:p>
+            <w:pPr>
+              <w:spacing w:after="40"/>
+            </w:pPr>
+            <w:r>
+              <w:rPr>
+                <w:rFonts w:ascii="微软雅黑" w:hAnsi="微软雅黑" w:eastAsia="微软雅黑"/>
+                <w:sz w:val="19"/>
+              </w:rPr>
+              <w:t>填写器</w:t>
+            </w:r>
+          </w:p>
+        </w:tc>
+        <w:tc>
+          <w:tcPr>
+            <w:tcW w:type="dxa" w:w="2448"/>
+            <w:vAlign w:val="top"/>
+            <w:tcBorders>
+              <w:top w:val="single" w:sz="4" w:space="0" w:color="A6A6A6"/>
+              <w:left w:val="single" w:sz="4" w:space="0" w:color="A6A6A6"/>
+              <w:bottom w:val="single" w:sz="4" w:space="0" w:color="A6A6A6"/>
+              <w:right w:val="single" w:sz="4" w:space="0" w:color="A6A6A6"/>
+            </w:tcBorders>
+          </w:tcPr>
+          <w:p>
+            <w:pPr>
+              <w:spacing w:after="40"/>
+            </w:pPr>
+            <w:r>
+              <w:rPr>
+                <w:rFonts w:ascii="微软雅黑" w:hAnsi="微软雅黑" w:eastAsia="微软雅黑"/>
+                <w:sz w:val="19"/>
+              </w:rPr>
+              <w:t>审批、审计、变更记录</w:t>
+            </w:r>
+          </w:p>
+        </w:tc>
+        <w:tc>
+          <w:tcPr>
+            <w:tcW w:type="dxa" w:w="3744"/>
+            <w:vAlign w:val="top"/>
+            <w:tcBorders>
+              <w:top w:val="single" w:sz="4" w:space="0" w:color="A6A6A6"/>
+              <w:left w:val="single" w:sz="4" w:space="0" w:color="A6A6A6"/>
+              <w:bottom w:val="single" w:sz="4" w:space="0" w:color="A6A6A6"/>
+              <w:right w:val="single" w:sz="4" w:space="0" w:color="A6A6A6"/>
+            </w:tcBorders>
+          </w:tcPr>
+          <w:p>
+            <w:pPr>
+              <w:spacing w:after="40"/>
+            </w:pPr>
+            <w:r>
+              <w:rPr>
+                <w:rFonts w:ascii="微软雅黑" w:hAnsi="微软雅黑" w:eastAsia="微软雅黑"/>
+                <w:sz w:val="19"/>
+              </w:rPr>
+              <w:t>字段变更、签名、附件、提交意见</w:t>
+            </w:r>
+          </w:p>
+        </w:tc>
+        <w:tc>
+          <w:tcPr>
+            <w:tcW w:type="dxa" w:w="4032"/>
+            <w:vAlign w:val="top"/>
+            <w:tcBorders>
+              <w:top w:val="single" w:sz="4" w:space="0" w:color="A6A6A6"/>
+              <w:left w:val="single" w:sz="4" w:space="0" w:color="A6A6A6"/>
+              <w:bottom w:val="single" w:sz="4" w:space="0" w:color="A6A6A6"/>
+              <w:right w:val="single" w:sz="4" w:space="0" w:color="A6A6A6"/>
+            </w:tcBorders>
+          </w:tcPr>
+          <w:p>
+            <w:pPr>
+              <w:spacing w:after="40"/>
+            </w:pPr>
+            <w:r>
+              <w:rPr>
+                <w:rFonts w:ascii="微软雅黑" w:hAnsi="微软雅黑" w:eastAsia="微软雅黑"/>
+                <w:sz w:val="19"/>
+              </w:rPr>
+              <w:t>提交形成字段级审计证据，并推动任务和批次状态变化。</w:t>
+            </w:r>
+          </w:p>
+        </w:tc>
+      </w:tr>
+      <w:tr>
+        <w:tc>
+          <w:tcPr>
+            <w:tcW w:type="dxa" w:w="1872"/>
+            <w:vAlign w:val="top"/>
+            <w:tcBorders>
+              <w:top w:val="single" w:sz="4" w:space="0" w:color="A6A6A6"/>
+              <w:left w:val="single" w:sz="4" w:space="0" w:color="A6A6A6"/>
+              <w:bottom w:val="single" w:sz="4" w:space="0" w:color="A6A6A6"/>
+              <w:right w:val="single" w:sz="4" w:space="0" w:color="A6A6A6"/>
+            </w:tcBorders>
+          </w:tcPr>
+          <w:p>
+            <w:pPr>
+              <w:spacing w:after="40"/>
+            </w:pPr>
+            <w:r>
+              <w:rPr>
+                <w:rFonts w:ascii="微软雅黑" w:hAnsi="微软雅黑" w:eastAsia="微软雅黑"/>
+                <w:sz w:val="19"/>
+              </w:rPr>
+              <w:t>质量驳回重开</w:t>
+            </w:r>
+          </w:p>
+        </w:tc>
+        <w:tc>
+          <w:tcPr>
+            <w:tcW w:type="dxa" w:w="2160"/>
+            <w:vAlign w:val="top"/>
+            <w:tcBorders>
+              <w:top w:val="single" w:sz="4" w:space="0" w:color="A6A6A6"/>
+              <w:left w:val="single" w:sz="4" w:space="0" w:color="A6A6A6"/>
+              <w:bottom w:val="single" w:sz="4" w:space="0" w:color="A6A6A6"/>
+              <w:right w:val="single" w:sz="4" w:space="0" w:color="A6A6A6"/>
+            </w:tcBorders>
+          </w:tcPr>
+          <w:p>
+            <w:pPr>
+              <w:spacing w:after="40"/>
+            </w:pPr>
+            <w:r>
+              <w:rPr>
+                <w:rFonts w:ascii="微软雅黑" w:hAnsi="微软雅黑" w:eastAsia="微软雅黑"/>
+                <w:sz w:val="19"/>
+              </w:rPr>
+              <w:t>质量审核</w:t>
+            </w:r>
+          </w:p>
+        </w:tc>
+        <w:tc>
+          <w:tcPr>
+            <w:tcW w:type="dxa" w:w="2448"/>
+            <w:vAlign w:val="top"/>
+            <w:tcBorders>
+              <w:top w:val="single" w:sz="4" w:space="0" w:color="A6A6A6"/>
+              <w:left w:val="single" w:sz="4" w:space="0" w:color="A6A6A6"/>
+              <w:bottom w:val="single" w:sz="4" w:space="0" w:color="A6A6A6"/>
+              <w:right w:val="single" w:sz="4" w:space="0" w:color="A6A6A6"/>
+            </w:tcBorders>
+          </w:tcPr>
+          <w:p>
+            <w:pPr>
+              <w:spacing w:after="40"/>
+            </w:pPr>
+            <w:r>
+              <w:rPr>
+                <w:rFonts w:ascii="微软雅黑" w:hAnsi="微软雅黑" w:eastAsia="微软雅黑"/>
+                <w:sz w:val="19"/>
+              </w:rPr>
+              <w:t>工作任务、变更记录</w:t>
+            </w:r>
+          </w:p>
+        </w:tc>
+        <w:tc>
+          <w:tcPr>
+            <w:tcW w:type="dxa" w:w="3744"/>
+            <w:vAlign w:val="top"/>
+            <w:tcBorders>
+              <w:top w:val="single" w:sz="4" w:space="0" w:color="A6A6A6"/>
+              <w:left w:val="single" w:sz="4" w:space="0" w:color="A6A6A6"/>
+              <w:bottom w:val="single" w:sz="4" w:space="0" w:color="A6A6A6"/>
+              <w:right w:val="single" w:sz="4" w:space="0" w:color="A6A6A6"/>
+            </w:tcBorders>
+          </w:tcPr>
+          <w:p>
+            <w:pPr>
+              <w:spacing w:after="40"/>
+            </w:pPr>
+            <w:r>
+              <w:rPr>
+                <w:rFonts w:ascii="微软雅黑" w:hAnsi="微软雅黑" w:eastAsia="微软雅黑"/>
+                <w:sz w:val="19"/>
+              </w:rPr>
+              <w:t>驳回原因、重开范围、补录依据</w:t>
+            </w:r>
+          </w:p>
+        </w:tc>
+        <w:tc>
+          <w:tcPr>
+            <w:tcW w:type="dxa" w:w="4032"/>
+            <w:vAlign w:val="top"/>
+            <w:tcBorders>
+              <w:top w:val="single" w:sz="4" w:space="0" w:color="A6A6A6"/>
+              <w:left w:val="single" w:sz="4" w:space="0" w:color="A6A6A6"/>
+              <w:bottom w:val="single" w:sz="4" w:space="0" w:color="A6A6A6"/>
+              <w:right w:val="single" w:sz="4" w:space="0" w:color="A6A6A6"/>
+            </w:tcBorders>
+          </w:tcPr>
+          <w:p>
+            <w:pPr>
+              <w:spacing w:after="40"/>
+            </w:pPr>
+            <w:r>
+              <w:rPr>
+                <w:rFonts w:ascii="微软雅黑" w:hAnsi="微软雅黑" w:eastAsia="微软雅黑"/>
+                <w:sz w:val="19"/>
+              </w:rPr>
+              <w:t>重开和补录必须保留原因、责任人、时间和影响范围。</w:t>
+            </w:r>
+          </w:p>
+        </w:tc>
+      </w:tr>
+      <w:tr>
+        <w:tc>
+          <w:tcPr>
+            <w:tcW w:type="dxa" w:w="1872"/>
+            <w:vAlign w:val="top"/>
+            <w:tcBorders>
+              <w:top w:val="single" w:sz="4" w:space="0" w:color="A6A6A6"/>
+              <w:left w:val="single" w:sz="4" w:space="0" w:color="A6A6A6"/>
+              <w:bottom w:val="single" w:sz="4" w:space="0" w:color="A6A6A6"/>
+              <w:right w:val="single" w:sz="4" w:space="0" w:color="A6A6A6"/>
+            </w:tcBorders>
+          </w:tcPr>
+          <w:p>
+            <w:pPr>
+              <w:spacing w:after="40"/>
+            </w:pPr>
+            <w:r>
+              <w:rPr>
+                <w:rFonts w:ascii="微软雅黑" w:hAnsi="微软雅黑" w:eastAsia="微软雅黑"/>
+                <w:sz w:val="19"/>
+              </w:rPr>
+              <w:t>归档交付</w:t>
+            </w:r>
+          </w:p>
+        </w:tc>
+        <w:tc>
+          <w:tcPr>
+            <w:tcW w:type="dxa" w:w="2160"/>
+            <w:vAlign w:val="top"/>
+            <w:tcBorders>
+              <w:top w:val="single" w:sz="4" w:space="0" w:color="A6A6A6"/>
+              <w:left w:val="single" w:sz="4" w:space="0" w:color="A6A6A6"/>
+              <w:bottom w:val="single" w:sz="4" w:space="0" w:color="A6A6A6"/>
+              <w:right w:val="single" w:sz="4" w:space="0" w:color="A6A6A6"/>
+            </w:tcBorders>
+          </w:tcPr>
+          <w:p>
+            <w:pPr>
+              <w:spacing w:after="40"/>
+            </w:pPr>
+            <w:r>
+              <w:rPr>
+                <w:rFonts w:ascii="微软雅黑" w:hAnsi="微软雅黑" w:eastAsia="微软雅黑"/>
+                <w:sz w:val="19"/>
+              </w:rPr>
+              <w:t>批次执行、字段审计</w:t>
+            </w:r>
+          </w:p>
+        </w:tc>
+        <w:tc>
+          <w:tcPr>
+            <w:tcW w:type="dxa" w:w="2448"/>
+            <w:vAlign w:val="top"/>
+            <w:tcBorders>
+              <w:top w:val="single" w:sz="4" w:space="0" w:color="A6A6A6"/>
+              <w:left w:val="single" w:sz="4" w:space="0" w:color="A6A6A6"/>
+              <w:bottom w:val="single" w:sz="4" w:space="0" w:color="A6A6A6"/>
+              <w:right w:val="single" w:sz="4" w:space="0" w:color="A6A6A6"/>
+            </w:tcBorders>
+          </w:tcPr>
+          <w:p>
+            <w:pPr>
+              <w:spacing w:after="40"/>
+            </w:pPr>
+            <w:r>
+              <w:rPr>
+                <w:rFonts w:ascii="微软雅黑" w:hAnsi="微软雅黑" w:eastAsia="微软雅黑"/>
+                <w:sz w:val="19"/>
+              </w:rPr>
+              <w:t>归档下载、追溯查询</w:t>
+            </w:r>
+          </w:p>
+        </w:tc>
+        <w:tc>
+          <w:tcPr>
+            <w:tcW w:type="dxa" w:w="3744"/>
+            <w:vAlign w:val="top"/>
+            <w:tcBorders>
+              <w:top w:val="single" w:sz="4" w:space="0" w:color="A6A6A6"/>
+              <w:left w:val="single" w:sz="4" w:space="0" w:color="A6A6A6"/>
+              <w:bottom w:val="single" w:sz="4" w:space="0" w:color="A6A6A6"/>
+              <w:right w:val="single" w:sz="4" w:space="0" w:color="A6A6A6"/>
+            </w:tcBorders>
+          </w:tcPr>
+          <w:p>
+            <w:pPr>
+              <w:spacing w:after="40"/>
+            </w:pPr>
+            <w:r>
+              <w:rPr>
+                <w:rFonts w:ascii="微软雅黑" w:hAnsi="微软雅黑" w:eastAsia="微软雅黑"/>
+                <w:sz w:val="19"/>
+              </w:rPr>
+              <w:t>归档包、归档记录、审计链摘要</w:t>
+            </w:r>
+          </w:p>
+        </w:tc>
+        <w:tc>
+          <w:tcPr>
+            <w:tcW w:type="dxa" w:w="4032"/>
+            <w:vAlign w:val="top"/>
+            <w:tcBorders>
+              <w:top w:val="single" w:sz="4" w:space="0" w:color="A6A6A6"/>
+              <w:left w:val="single" w:sz="4" w:space="0" w:color="A6A6A6"/>
+              <w:bottom w:val="single" w:sz="4" w:space="0" w:color="A6A6A6"/>
+              <w:right w:val="single" w:sz="4" w:space="0" w:color="A6A6A6"/>
+            </w:tcBorders>
+          </w:tcPr>
+          <w:p>
+            <w:pPr>
+              <w:spacing w:after="40"/>
+            </w:pPr>
+            <w:r>
+              <w:rPr>
+                <w:rFonts w:ascii="微软雅黑" w:hAnsi="微软雅黑" w:eastAsia="微软雅黑"/>
+                <w:sz w:val="19"/>
+              </w:rPr>
+              <w:t>归档内容需与批次终态、填写记录和审计证据一致。</w:t>
+            </w:r>
+          </w:p>
+        </w:tc>
+      </w:tr>
+    </w:tbl>
+    <w:p/>
+    <w:p>
+      <w:pPr>
+        <w:spacing w:before="160" w:after="80"/>
+        <w:jc w:val="left"/>
+        <w:shd w:fill="1D2330"/>
+      </w:pPr>
+      <w:r>
+        <w:rPr>
+          <w:rFonts w:ascii="微软雅黑" w:hAnsi="微软雅黑" w:eastAsia="微软雅黑"/>
+          <w:b/>
+          <w:color w:val="FFFFFF"/>
+          <w:sz w:val="24"/>
+        </w:rPr>
+        <w:t>2.11 数据域概要</w:t>
+      </w:r>
+    </w:p>
+    <w:tbl>
+      <w:tblPr>
+        <w:tblStyle w:val="TableGrid"/>
+        <w:tblW w:type="auto" w:w="0"/>
+        <w:jc w:val="center"/>
+        <w:tblLook w:firstColumn="1" w:firstRow="1" w:lastColumn="0" w:lastRow="0" w:noHBand="0" w:noVBand="1" w:val="04A0"/>
+      </w:tblPr>
+      <w:tblGrid>
+        <w:gridCol w:w="2340"/>
+        <w:gridCol w:w="2340"/>
+        <w:gridCol w:w="2340"/>
+        <w:gridCol w:w="2340"/>
+      </w:tblGrid>
+      <w:tr>
+        <w:tc>
+          <w:tcPr>
+            <w:tcW w:type="dxa" w:w="1872"/>
+            <w:shd w:fill="1D2330"/>
+            <w:tcBorders>
+              <w:top w:val="single" w:sz="4" w:space="0" w:color="A6A6A6"/>
+              <w:left w:val="single" w:sz="4" w:space="0" w:color="A6A6A6"/>
+              <w:bottom w:val="single" w:sz="4" w:space="0" w:color="A6A6A6"/>
+              <w:right w:val="single" w:sz="4" w:space="0" w:color="A6A6A6"/>
+            </w:tcBorders>
+          </w:tcPr>
+          <w:p>
+            <w:pPr>
+              <w:jc w:val="center"/>
+            </w:pPr>
+            <w:r>
+              <w:rPr>
+                <w:rFonts w:ascii="微软雅黑" w:hAnsi="微软雅黑" w:eastAsia="微软雅黑"/>
+                <w:b/>
+                <w:color w:val="FFFFFF"/>
+                <w:sz w:val="20"/>
+              </w:rPr>
+              <w:t>数据域</w:t>
+            </w:r>
+          </w:p>
+        </w:tc>
+        <w:tc>
+          <w:tcPr>
+            <w:tcW w:type="dxa" w:w="3456"/>
+            <w:shd w:fill="1D2330"/>
+            <w:tcBorders>
+              <w:top w:val="single" w:sz="4" w:space="0" w:color="A6A6A6"/>
+              <w:left w:val="single" w:sz="4" w:space="0" w:color="A6A6A6"/>
+              <w:bottom w:val="single" w:sz="4" w:space="0" w:color="A6A6A6"/>
+              <w:right w:val="single" w:sz="4" w:space="0" w:color="A6A6A6"/>
+            </w:tcBorders>
+          </w:tcPr>
+          <w:p>
+            <w:pPr>
+              <w:jc w:val="center"/>
+            </w:pPr>
+            <w:r>
+              <w:rPr>
+                <w:rFonts w:ascii="微软雅黑" w:hAnsi="微软雅黑" w:eastAsia="微软雅黑"/>
+                <w:b/>
+                <w:color w:val="FFFFFF"/>
+                <w:sz w:val="20"/>
+              </w:rPr>
+              <w:t>核心对象</w:t>
+            </w:r>
+          </w:p>
+        </w:tc>
+        <w:tc>
+          <w:tcPr>
+            <w:tcW w:type="dxa" w:w="3024"/>
+            <w:shd w:fill="1D2330"/>
+            <w:tcBorders>
+              <w:top w:val="single" w:sz="4" w:space="0" w:color="A6A6A6"/>
+              <w:left w:val="single" w:sz="4" w:space="0" w:color="A6A6A6"/>
+              <w:bottom w:val="single" w:sz="4" w:space="0" w:color="A6A6A6"/>
+              <w:right w:val="single" w:sz="4" w:space="0" w:color="A6A6A6"/>
+            </w:tcBorders>
+          </w:tcPr>
+          <w:p>
+            <w:pPr>
+              <w:jc w:val="center"/>
+            </w:pPr>
+            <w:r>
+              <w:rPr>
+                <w:rFonts w:ascii="微软雅黑" w:hAnsi="微软雅黑" w:eastAsia="微软雅黑"/>
+                <w:b/>
+                <w:color w:val="FFFFFF"/>
+                <w:sz w:val="20"/>
+              </w:rPr>
+              <w:t>生命周期</w:t>
+            </w:r>
+          </w:p>
+        </w:tc>
+        <w:tc>
+          <w:tcPr>
+            <w:tcW w:type="dxa" w:w="4464"/>
+            <w:shd w:fill="1D2330"/>
+            <w:tcBorders>
+              <w:top w:val="single" w:sz="4" w:space="0" w:color="A6A6A6"/>
+              <w:left w:val="single" w:sz="4" w:space="0" w:color="A6A6A6"/>
+              <w:bottom w:val="single" w:sz="4" w:space="0" w:color="A6A6A6"/>
+              <w:right w:val="single" w:sz="4" w:space="0" w:color="A6A6A6"/>
+            </w:tcBorders>
+          </w:tcPr>
+          <w:p>
+            <w:pPr>
+              <w:jc w:val="center"/>
+            </w:pPr>
+            <w:r>
+              <w:rPr>
+                <w:rFonts w:ascii="微软雅黑" w:hAnsi="微软雅黑" w:eastAsia="微软雅黑"/>
+                <w:b/>
+                <w:color w:val="FFFFFF"/>
+                <w:sz w:val="20"/>
+              </w:rPr>
+              <w:t>概要设计说明</w:t>
+            </w:r>
+          </w:p>
+        </w:tc>
+      </w:tr>
+      <w:tr>
+        <w:tc>
+          <w:tcPr>
+            <w:tcW w:type="dxa" w:w="1872"/>
+            <w:vAlign w:val="top"/>
+            <w:tcBorders>
+              <w:top w:val="single" w:sz="4" w:space="0" w:color="A6A6A6"/>
+              <w:left w:val="single" w:sz="4" w:space="0" w:color="A6A6A6"/>
+              <w:bottom w:val="single" w:sz="4" w:space="0" w:color="A6A6A6"/>
+              <w:right w:val="single" w:sz="4" w:space="0" w:color="A6A6A6"/>
+            </w:tcBorders>
+          </w:tcPr>
+          <w:p>
+            <w:pPr>
+              <w:spacing w:after="40"/>
+            </w:pPr>
+            <w:r>
+              <w:rPr>
+                <w:rFonts w:ascii="微软雅黑" w:hAnsi="微软雅黑" w:eastAsia="微软雅黑"/>
+                <w:sz w:val="19"/>
+              </w:rPr>
+              <w:t>模板定义域</w:t>
+            </w:r>
+          </w:p>
+        </w:tc>
+        <w:tc>
+          <w:tcPr>
+            <w:tcW w:type="dxa" w:w="3456"/>
+            <w:vAlign w:val="top"/>
+            <w:tcBorders>
+              <w:top w:val="single" w:sz="4" w:space="0" w:color="A6A6A6"/>
+              <w:left w:val="single" w:sz="4" w:space="0" w:color="A6A6A6"/>
+              <w:bottom w:val="single" w:sz="4" w:space="0" w:color="A6A6A6"/>
+              <w:right w:val="single" w:sz="4" w:space="0" w:color="A6A6A6"/>
+            </w:tcBorders>
+          </w:tcPr>
+          <w:p>
+            <w:pPr>
+              <w:spacing w:after="40"/>
+            </w:pPr>
+            <w:r>
+              <w:rPr>
+                <w:rFonts w:ascii="微软雅黑" w:hAnsi="微软雅黑" w:eastAsia="微软雅黑"/>
+                <w:sz w:val="19"/>
+              </w:rPr>
+              <w:t>批记录报表、报表版本、单元格规则、签名单元格</w:t>
+            </w:r>
+          </w:p>
+        </w:tc>
+        <w:tc>
+          <w:tcPr>
+            <w:tcW w:type="dxa" w:w="3024"/>
+            <w:vAlign w:val="top"/>
+            <w:tcBorders>
+              <w:top w:val="single" w:sz="4" w:space="0" w:color="A6A6A6"/>
+              <w:left w:val="single" w:sz="4" w:space="0" w:color="A6A6A6"/>
+              <w:bottom w:val="single" w:sz="4" w:space="0" w:color="A6A6A6"/>
+              <w:right w:val="single" w:sz="4" w:space="0" w:color="A6A6A6"/>
+            </w:tcBorders>
+          </w:tcPr>
+          <w:p>
+            <w:pPr>
+              <w:spacing w:after="40"/>
+            </w:pPr>
+            <w:r>
+              <w:rPr>
+                <w:rFonts w:ascii="微软雅黑" w:hAnsi="微软雅黑" w:eastAsia="微软雅黑"/>
+                <w:sz w:val="19"/>
+              </w:rPr>
+              <w:t>导入、识别、设计、确认、发布、升版、停用</w:t>
+            </w:r>
+          </w:p>
+        </w:tc>
+        <w:tc>
+          <w:tcPr>
+            <w:tcW w:type="dxa" w:w="4464"/>
+            <w:vAlign w:val="top"/>
+            <w:tcBorders>
+              <w:top w:val="single" w:sz="4" w:space="0" w:color="A6A6A6"/>
+              <w:left w:val="single" w:sz="4" w:space="0" w:color="A6A6A6"/>
+              <w:bottom w:val="single" w:sz="4" w:space="0" w:color="A6A6A6"/>
+              <w:right w:val="single" w:sz="4" w:space="0" w:color="A6A6A6"/>
+            </w:tcBorders>
+          </w:tcPr>
+          <w:p>
+            <w:pPr>
+              <w:spacing w:after="40"/>
+            </w:pPr>
+            <w:r>
+              <w:rPr>
+                <w:rFonts w:ascii="微软雅黑" w:hAnsi="微软雅黑" w:eastAsia="微软雅黑"/>
+                <w:sz w:val="19"/>
+              </w:rPr>
+              <w:t>定义正式批记录载体和填写规则，是运行态批记录的来源。</w:t>
+            </w:r>
+          </w:p>
+        </w:tc>
+      </w:tr>
+      <w:tr>
+        <w:tc>
+          <w:tcPr>
+            <w:tcW w:type="dxa" w:w="1872"/>
+            <w:vAlign w:val="top"/>
+            <w:tcBorders>
+              <w:top w:val="single" w:sz="4" w:space="0" w:color="A6A6A6"/>
+              <w:left w:val="single" w:sz="4" w:space="0" w:color="A6A6A6"/>
+              <w:bottom w:val="single" w:sz="4" w:space="0" w:color="A6A6A6"/>
+              <w:right w:val="single" w:sz="4" w:space="0" w:color="A6A6A6"/>
+            </w:tcBorders>
+          </w:tcPr>
+          <w:p>
+            <w:pPr>
+              <w:spacing w:after="40"/>
+            </w:pPr>
+            <w:r>
+              <w:rPr>
+                <w:rFonts w:ascii="微软雅黑" w:hAnsi="微软雅黑" w:eastAsia="微软雅黑"/>
+                <w:sz w:val="19"/>
+              </w:rPr>
+              <w:t>路线绑定域</w:t>
+            </w:r>
+          </w:p>
+        </w:tc>
+        <w:tc>
+          <w:tcPr>
+            <w:tcW w:type="dxa" w:w="3456"/>
+            <w:vAlign w:val="top"/>
+            <w:tcBorders>
+              <w:top w:val="single" w:sz="4" w:space="0" w:color="A6A6A6"/>
+              <w:left w:val="single" w:sz="4" w:space="0" w:color="A6A6A6"/>
+              <w:bottom w:val="single" w:sz="4" w:space="0" w:color="A6A6A6"/>
+              <w:right w:val="single" w:sz="4" w:space="0" w:color="A6A6A6"/>
+            </w:tcBorders>
+          </w:tcPr>
+          <w:p>
+            <w:pPr>
+              <w:spacing w:after="40"/>
+            </w:pPr>
+            <w:r>
+              <w:rPr>
+                <w:rFonts w:ascii="微软雅黑" w:hAnsi="微软雅黑" w:eastAsia="微软雅黑"/>
+                <w:sz w:val="19"/>
+              </w:rPr>
+              <w:t>工艺路线、工序、批记录表单绑定、表单槽位、工序开始配置</w:t>
+            </w:r>
+          </w:p>
+        </w:tc>
+        <w:tc>
+          <w:tcPr>
+            <w:tcW w:type="dxa" w:w="3024"/>
+            <w:vAlign w:val="top"/>
+            <w:tcBorders>
+              <w:top w:val="single" w:sz="4" w:space="0" w:color="A6A6A6"/>
+              <w:left w:val="single" w:sz="4" w:space="0" w:color="A6A6A6"/>
+              <w:bottom w:val="single" w:sz="4" w:space="0" w:color="A6A6A6"/>
+              <w:right w:val="single" w:sz="4" w:space="0" w:color="A6A6A6"/>
+            </w:tcBorders>
+          </w:tcPr>
+          <w:p>
+            <w:pPr>
+              <w:spacing w:after="40"/>
+            </w:pPr>
+            <w:r>
+              <w:rPr>
+                <w:rFonts w:ascii="微软雅黑" w:hAnsi="微软雅黑" w:eastAsia="微软雅黑"/>
+                <w:sz w:val="19"/>
+              </w:rPr>
+              <w:t>草稿、保存、发布、引用、变更</w:t>
+            </w:r>
+          </w:p>
+        </w:tc>
+        <w:tc>
+          <w:tcPr>
+            <w:tcW w:type="dxa" w:w="4464"/>
+            <w:vAlign w:val="top"/>
+            <w:tcBorders>
+              <w:top w:val="single" w:sz="4" w:space="0" w:color="A6A6A6"/>
+              <w:left w:val="single" w:sz="4" w:space="0" w:color="A6A6A6"/>
+              <w:bottom w:val="single" w:sz="4" w:space="0" w:color="A6A6A6"/>
+              <w:right w:val="single" w:sz="4" w:space="0" w:color="A6A6A6"/>
+            </w:tcBorders>
+          </w:tcPr>
+          <w:p>
+            <w:pPr>
+              <w:spacing w:after="40"/>
+            </w:pPr>
+            <w:r>
+              <w:rPr>
+                <w:rFonts w:ascii="微软雅黑" w:hAnsi="微软雅黑" w:eastAsia="微软雅黑"/>
+                <w:sz w:val="19"/>
+              </w:rPr>
+              <w:t>为批次执行提供逐工序配置来源，必须区分正式批记录和补充表单。</w:t>
+            </w:r>
+          </w:p>
+        </w:tc>
+      </w:tr>
+      <w:tr>
+        <w:tc>
+          <w:tcPr>
+            <w:tcW w:type="dxa" w:w="1872"/>
+            <w:vAlign w:val="top"/>
+            <w:tcBorders>
+              <w:top w:val="single" w:sz="4" w:space="0" w:color="A6A6A6"/>
+              <w:left w:val="single" w:sz="4" w:space="0" w:color="A6A6A6"/>
+              <w:bottom w:val="single" w:sz="4" w:space="0" w:color="A6A6A6"/>
+              <w:right w:val="single" w:sz="4" w:space="0" w:color="A6A6A6"/>
+            </w:tcBorders>
+          </w:tcPr>
+          <w:p>
+            <w:pPr>
+              <w:spacing w:after="40"/>
+            </w:pPr>
+            <w:r>
+              <w:rPr>
+                <w:rFonts w:ascii="微软雅黑" w:hAnsi="微软雅黑" w:eastAsia="微软雅黑"/>
+                <w:sz w:val="19"/>
+              </w:rPr>
+              <w:t>批次执行域</w:t>
+            </w:r>
+          </w:p>
+        </w:tc>
+        <w:tc>
+          <w:tcPr>
+            <w:tcW w:type="dxa" w:w="3456"/>
+            <w:vAlign w:val="top"/>
+            <w:tcBorders>
+              <w:top w:val="single" w:sz="4" w:space="0" w:color="A6A6A6"/>
+              <w:left w:val="single" w:sz="4" w:space="0" w:color="A6A6A6"/>
+              <w:bottom w:val="single" w:sz="4" w:space="0" w:color="A6A6A6"/>
+              <w:right w:val="single" w:sz="4" w:space="0" w:color="A6A6A6"/>
+            </w:tcBorders>
+          </w:tcPr>
+          <w:p>
+            <w:pPr>
+              <w:spacing w:after="40"/>
+            </w:pPr>
+            <w:r>
+              <w:rPr>
+                <w:rFonts w:ascii="微软雅黑" w:hAnsi="微软雅黑" w:eastAsia="微软雅黑"/>
+                <w:sz w:val="19"/>
+              </w:rPr>
+              <w:t>EDHR 批次执行、批次快照、执行状态、关闭/作废信息</w:t>
+            </w:r>
+          </w:p>
+        </w:tc>
+        <w:tc>
+          <w:tcPr>
+            <w:tcW w:type="dxa" w:w="3024"/>
+            <w:vAlign w:val="top"/>
+            <w:tcBorders>
+              <w:top w:val="single" w:sz="4" w:space="0" w:color="A6A6A6"/>
+              <w:left w:val="single" w:sz="4" w:space="0" w:color="A6A6A6"/>
+              <w:bottom w:val="single" w:sz="4" w:space="0" w:color="A6A6A6"/>
+              <w:right w:val="single" w:sz="4" w:space="0" w:color="A6A6A6"/>
+            </w:tcBorders>
+          </w:tcPr>
+          <w:p>
+            <w:pPr>
+              <w:spacing w:after="40"/>
+            </w:pPr>
+            <w:r>
+              <w:rPr>
+                <w:rFonts w:ascii="微软雅黑" w:hAnsi="微软雅黑" w:eastAsia="微软雅黑"/>
+                <w:sz w:val="19"/>
+              </w:rPr>
+              <w:t>创建、执行、驳回、补录、关闭、归档、作废</w:t>
+            </w:r>
+          </w:p>
+        </w:tc>
+        <w:tc>
+          <w:tcPr>
+            <w:tcW w:type="dxa" w:w="4464"/>
+            <w:vAlign w:val="top"/>
+            <w:tcBorders>
+              <w:top w:val="single" w:sz="4" w:space="0" w:color="A6A6A6"/>
+              <w:left w:val="single" w:sz="4" w:space="0" w:color="A6A6A6"/>
+              <w:bottom w:val="single" w:sz="4" w:space="0" w:color="A6A6A6"/>
+              <w:right w:val="single" w:sz="4" w:space="0" w:color="A6A6A6"/>
+            </w:tcBorders>
+          </w:tcPr>
+          <w:p>
+            <w:pPr>
+              <w:spacing w:after="40"/>
+            </w:pPr>
+            <w:r>
+              <w:rPr>
+                <w:rFonts w:ascii="微软雅黑" w:hAnsi="微软雅黑" w:eastAsia="微软雅黑"/>
+                <w:sz w:val="19"/>
+              </w:rPr>
+              <w:t>承载单个生产批次的全过程电子批记录运行态。</w:t>
+            </w:r>
+          </w:p>
+        </w:tc>
+      </w:tr>
+      <w:tr>
+        <w:tc>
+          <w:tcPr>
+            <w:tcW w:type="dxa" w:w="1872"/>
+            <w:vAlign w:val="top"/>
+            <w:tcBorders>
+              <w:top w:val="single" w:sz="4" w:space="0" w:color="A6A6A6"/>
+              <w:left w:val="single" w:sz="4" w:space="0" w:color="A6A6A6"/>
+              <w:bottom w:val="single" w:sz="4" w:space="0" w:color="A6A6A6"/>
+              <w:right w:val="single" w:sz="4" w:space="0" w:color="A6A6A6"/>
+            </w:tcBorders>
+          </w:tcPr>
+          <w:p>
+            <w:pPr>
+              <w:spacing w:after="40"/>
+            </w:pPr>
+            <w:r>
+              <w:rPr>
+                <w:rFonts w:ascii="微软雅黑" w:hAnsi="微软雅黑" w:eastAsia="微软雅黑"/>
+                <w:sz w:val="19"/>
+              </w:rPr>
+              <w:t>任务域</w:t>
+            </w:r>
+          </w:p>
+        </w:tc>
+        <w:tc>
+          <w:tcPr>
+            <w:tcW w:type="dxa" w:w="3456"/>
+            <w:vAlign w:val="top"/>
+            <w:tcBorders>
+              <w:top w:val="single" w:sz="4" w:space="0" w:color="A6A6A6"/>
+              <w:left w:val="single" w:sz="4" w:space="0" w:color="A6A6A6"/>
+              <w:bottom w:val="single" w:sz="4" w:space="0" w:color="A6A6A6"/>
+              <w:right w:val="single" w:sz="4" w:space="0" w:color="A6A6A6"/>
+            </w:tcBorders>
+          </w:tcPr>
+          <w:p>
+            <w:pPr>
+              <w:spacing w:after="40"/>
+            </w:pPr>
+            <w:r>
+              <w:rPr>
+                <w:rFonts w:ascii="微软雅黑" w:hAnsi="微软雅黑" w:eastAsia="微软雅黑"/>
+                <w:sz w:val="19"/>
+              </w:rPr>
+              <w:t>工作任务、负责人、候选人、任务状态、允许动作</w:t>
+            </w:r>
+          </w:p>
+        </w:tc>
+        <w:tc>
+          <w:tcPr>
+            <w:tcW w:type="dxa" w:w="3024"/>
+            <w:vAlign w:val="top"/>
+            <w:tcBorders>
+              <w:top w:val="single" w:sz="4" w:space="0" w:color="A6A6A6"/>
+              <w:left w:val="single" w:sz="4" w:space="0" w:color="A6A6A6"/>
+              <w:bottom w:val="single" w:sz="4" w:space="0" w:color="A6A6A6"/>
+              <w:right w:val="single" w:sz="4" w:space="0" w:color="A6A6A6"/>
+            </w:tcBorders>
+          </w:tcPr>
+          <w:p>
+            <w:pPr>
+              <w:spacing w:after="40"/>
+            </w:pPr>
+            <w:r>
+              <w:rPr>
+                <w:rFonts w:ascii="微软雅黑" w:hAnsi="微软雅黑" w:eastAsia="微软雅黑"/>
+                <w:sz w:val="19"/>
+              </w:rPr>
+              <w:t>生成、领取、打开、填写、提交、跳过、关闭</w:t>
+            </w:r>
+          </w:p>
+        </w:tc>
+        <w:tc>
+          <w:tcPr>
+            <w:tcW w:type="dxa" w:w="4464"/>
+            <w:vAlign w:val="top"/>
+            <w:tcBorders>
+              <w:top w:val="single" w:sz="4" w:space="0" w:color="A6A6A6"/>
+              <w:left w:val="single" w:sz="4" w:space="0" w:color="A6A6A6"/>
+              <w:bottom w:val="single" w:sz="4" w:space="0" w:color="A6A6A6"/>
+              <w:right w:val="single" w:sz="4" w:space="0" w:color="A6A6A6"/>
+            </w:tcBorders>
+          </w:tcPr>
+          <w:p>
+            <w:pPr>
+              <w:spacing w:after="40"/>
+            </w:pPr>
+            <w:r>
+              <w:rPr>
+                <w:rFonts w:ascii="微软雅黑" w:hAnsi="微软雅黑" w:eastAsia="微软雅黑"/>
+                <w:sz w:val="19"/>
+              </w:rPr>
+              <w:t>承接用户可处理事项，保证工作台与批次状态一致。</w:t>
+            </w:r>
+          </w:p>
+        </w:tc>
+      </w:tr>
+      <w:tr>
+        <w:tc>
+          <w:tcPr>
+            <w:tcW w:type="dxa" w:w="1872"/>
+            <w:vAlign w:val="top"/>
+            <w:tcBorders>
+              <w:top w:val="single" w:sz="4" w:space="0" w:color="A6A6A6"/>
+              <w:left w:val="single" w:sz="4" w:space="0" w:color="A6A6A6"/>
+              <w:bottom w:val="single" w:sz="4" w:space="0" w:color="A6A6A6"/>
+              <w:right w:val="single" w:sz="4" w:space="0" w:color="A6A6A6"/>
+            </w:tcBorders>
+          </w:tcPr>
+          <w:p>
+            <w:pPr>
+              <w:spacing w:after="40"/>
+            </w:pPr>
+            <w:r>
+              <w:rPr>
+                <w:rFonts w:ascii="微软雅黑" w:hAnsi="微软雅黑" w:eastAsia="微软雅黑"/>
+                <w:sz w:val="19"/>
+              </w:rPr>
+              <w:t>填写结果域</w:t>
+            </w:r>
+          </w:p>
+        </w:tc>
+        <w:tc>
+          <w:tcPr>
+            <w:tcW w:type="dxa" w:w="3456"/>
+            <w:vAlign w:val="top"/>
+            <w:tcBorders>
+              <w:top w:val="single" w:sz="4" w:space="0" w:color="A6A6A6"/>
+              <w:left w:val="single" w:sz="4" w:space="0" w:color="A6A6A6"/>
+              <w:bottom w:val="single" w:sz="4" w:space="0" w:color="A6A6A6"/>
+              <w:right w:val="single" w:sz="4" w:space="0" w:color="A6A6A6"/>
+            </w:tcBorders>
+          </w:tcPr>
+          <w:p>
+            <w:pPr>
+              <w:spacing w:after="40"/>
+            </w:pPr>
+            <w:r>
+              <w:rPr>
+                <w:rFonts w:ascii="微软雅黑" w:hAnsi="微软雅黑" w:eastAsia="微软雅黑"/>
+                <w:sz w:val="19"/>
+              </w:rPr>
+              <w:t>执行记录、单元格值、签名、附件、提交意见</w:t>
+            </w:r>
+          </w:p>
+        </w:tc>
+        <w:tc>
+          <w:tcPr>
+            <w:tcW w:type="dxa" w:w="3024"/>
+            <w:vAlign w:val="top"/>
+            <w:tcBorders>
+              <w:top w:val="single" w:sz="4" w:space="0" w:color="A6A6A6"/>
+              <w:left w:val="single" w:sz="4" w:space="0" w:color="A6A6A6"/>
+              <w:bottom w:val="single" w:sz="4" w:space="0" w:color="A6A6A6"/>
+              <w:right w:val="single" w:sz="4" w:space="0" w:color="A6A6A6"/>
+            </w:tcBorders>
+          </w:tcPr>
+          <w:p>
+            <w:pPr>
+              <w:spacing w:after="40"/>
+            </w:pPr>
+            <w:r>
+              <w:rPr>
+                <w:rFonts w:ascii="微软雅黑" w:hAnsi="微软雅黑" w:eastAsia="微软雅黑"/>
+                <w:sz w:val="19"/>
+              </w:rPr>
+              <w:t>草稿、保存、提交、审核、只读追溯</w:t>
+            </w:r>
+          </w:p>
+        </w:tc>
+        <w:tc>
+          <w:tcPr>
+            <w:tcW w:type="dxa" w:w="4464"/>
+            <w:vAlign w:val="top"/>
+            <w:tcBorders>
+              <w:top w:val="single" w:sz="4" w:space="0" w:color="A6A6A6"/>
+              <w:left w:val="single" w:sz="4" w:space="0" w:color="A6A6A6"/>
+              <w:bottom w:val="single" w:sz="4" w:space="0" w:color="A6A6A6"/>
+              <w:right w:val="single" w:sz="4" w:space="0" w:color="A6A6A6"/>
+            </w:tcBorders>
+          </w:tcPr>
+          <w:p>
+            <w:pPr>
+              <w:spacing w:after="40"/>
+            </w:pPr>
+            <w:r>
+              <w:rPr>
+                <w:rFonts w:ascii="微软雅黑" w:hAnsi="微软雅黑" w:eastAsia="微软雅黑"/>
+                <w:sz w:val="19"/>
+              </w:rPr>
+              <w:t>保存批记录填写结果，并形成字段级审计依据。</w:t>
+            </w:r>
+          </w:p>
+        </w:tc>
+      </w:tr>
+      <w:tr>
+        <w:tc>
+          <w:tcPr>
+            <w:tcW w:type="dxa" w:w="1872"/>
+            <w:vAlign w:val="top"/>
+            <w:tcBorders>
+              <w:top w:val="single" w:sz="4" w:space="0" w:color="A6A6A6"/>
+              <w:left w:val="single" w:sz="4" w:space="0" w:color="A6A6A6"/>
+              <w:bottom w:val="single" w:sz="4" w:space="0" w:color="A6A6A6"/>
+              <w:right w:val="single" w:sz="4" w:space="0" w:color="A6A6A6"/>
+            </w:tcBorders>
+          </w:tcPr>
+          <w:p>
+            <w:pPr>
+              <w:spacing w:after="40"/>
+            </w:pPr>
+            <w:r>
+              <w:rPr>
+                <w:rFonts w:ascii="微软雅黑" w:hAnsi="微软雅黑" w:eastAsia="微软雅黑"/>
+                <w:sz w:val="19"/>
+              </w:rPr>
+              <w:t>审计追溯域</w:t>
+            </w:r>
+          </w:p>
+        </w:tc>
+        <w:tc>
+          <w:tcPr>
+            <w:tcW w:type="dxa" w:w="3456"/>
+            <w:vAlign w:val="top"/>
+            <w:tcBorders>
+              <w:top w:val="single" w:sz="4" w:space="0" w:color="A6A6A6"/>
+              <w:left w:val="single" w:sz="4" w:space="0" w:color="A6A6A6"/>
+              <w:bottom w:val="single" w:sz="4" w:space="0" w:color="A6A6A6"/>
+              <w:right w:val="single" w:sz="4" w:space="0" w:color="A6A6A6"/>
+            </w:tcBorders>
+          </w:tcPr>
+          <w:p>
+            <w:pPr>
+              <w:spacing w:after="40"/>
+            </w:pPr>
+            <w:r>
+              <w:rPr>
+                <w:rFonts w:ascii="微软雅黑" w:hAnsi="微软雅黑" w:eastAsia="微软雅黑"/>
+                <w:sz w:val="19"/>
+              </w:rPr>
+              <w:t>字段审计、域追溯、操作审计、变更记录</w:t>
+            </w:r>
+          </w:p>
+        </w:tc>
+        <w:tc>
+          <w:tcPr>
+            <w:tcW w:type="dxa" w:w="3024"/>
+            <w:vAlign w:val="top"/>
+            <w:tcBorders>
+              <w:top w:val="single" w:sz="4" w:space="0" w:color="A6A6A6"/>
+              <w:left w:val="single" w:sz="4" w:space="0" w:color="A6A6A6"/>
+              <w:bottom w:val="single" w:sz="4" w:space="0" w:color="A6A6A6"/>
+              <w:right w:val="single" w:sz="4" w:space="0" w:color="A6A6A6"/>
+            </w:tcBorders>
+          </w:tcPr>
+          <w:p>
+            <w:pPr>
+              <w:spacing w:after="40"/>
+            </w:pPr>
+            <w:r>
+              <w:rPr>
+                <w:rFonts w:ascii="微软雅黑" w:hAnsi="微软雅黑" w:eastAsia="微软雅黑"/>
+                <w:sz w:val="19"/>
+              </w:rPr>
+              <w:t>记录、串联、查询、核验、导出</w:t>
+            </w:r>
+          </w:p>
+        </w:tc>
+        <w:tc>
+          <w:tcPr>
+            <w:tcW w:type="dxa" w:w="4464"/>
+            <w:vAlign w:val="top"/>
+            <w:tcBorders>
+              <w:top w:val="single" w:sz="4" w:space="0" w:color="A6A6A6"/>
+              <w:left w:val="single" w:sz="4" w:space="0" w:color="A6A6A6"/>
+              <w:bottom w:val="single" w:sz="4" w:space="0" w:color="A6A6A6"/>
+              <w:right w:val="single" w:sz="4" w:space="0" w:color="A6A6A6"/>
+            </w:tcBorders>
+          </w:tcPr>
+          <w:p>
+            <w:pPr>
+              <w:spacing w:after="40"/>
+            </w:pPr>
+            <w:r>
+              <w:rPr>
+                <w:rFonts w:ascii="微软雅黑" w:hAnsi="微软雅黑" w:eastAsia="微软雅黑"/>
+                <w:sz w:val="19"/>
+              </w:rPr>
+              <w:t>满足质量审核和合规追溯要求。</w:t>
+            </w:r>
+          </w:p>
+        </w:tc>
+      </w:tr>
+      <w:tr>
+        <w:tc>
+          <w:tcPr>
+            <w:tcW w:type="dxa" w:w="1872"/>
+            <w:vAlign w:val="top"/>
+            <w:tcBorders>
+              <w:top w:val="single" w:sz="4" w:space="0" w:color="A6A6A6"/>
+              <w:left w:val="single" w:sz="4" w:space="0" w:color="A6A6A6"/>
+              <w:bottom w:val="single" w:sz="4" w:space="0" w:color="A6A6A6"/>
+              <w:right w:val="single" w:sz="4" w:space="0" w:color="A6A6A6"/>
+            </w:tcBorders>
+          </w:tcPr>
+          <w:p>
+            <w:pPr>
+              <w:spacing w:after="40"/>
+            </w:pPr>
+            <w:r>
+              <w:rPr>
+                <w:rFonts w:ascii="微软雅黑" w:hAnsi="微软雅黑" w:eastAsia="微软雅黑"/>
+                <w:sz w:val="19"/>
+              </w:rPr>
+              <w:t>归档交付域</w:t>
+            </w:r>
+          </w:p>
+        </w:tc>
+        <w:tc>
+          <w:tcPr>
+            <w:tcW w:type="dxa" w:w="3456"/>
+            <w:vAlign w:val="top"/>
+            <w:tcBorders>
+              <w:top w:val="single" w:sz="4" w:space="0" w:color="A6A6A6"/>
+              <w:left w:val="single" w:sz="4" w:space="0" w:color="A6A6A6"/>
+              <w:bottom w:val="single" w:sz="4" w:space="0" w:color="A6A6A6"/>
+              <w:right w:val="single" w:sz="4" w:space="0" w:color="A6A6A6"/>
+            </w:tcBorders>
+          </w:tcPr>
+          <w:p>
+            <w:pPr>
+              <w:spacing w:after="40"/>
+            </w:pPr>
+            <w:r>
+              <w:rPr>
+                <w:rFonts w:ascii="微软雅黑" w:hAnsi="微软雅黑" w:eastAsia="微软雅黑"/>
+                <w:sz w:val="19"/>
+              </w:rPr>
+              <w:t>归档记录、归档文件、归档失效标识、下载日志</w:t>
+            </w:r>
+          </w:p>
+        </w:tc>
+        <w:tc>
+          <w:tcPr>
+            <w:tcW w:type="dxa" w:w="3024"/>
+            <w:vAlign w:val="top"/>
+            <w:tcBorders>
+              <w:top w:val="single" w:sz="4" w:space="0" w:color="A6A6A6"/>
+              <w:left w:val="single" w:sz="4" w:space="0" w:color="A6A6A6"/>
+              <w:bottom w:val="single" w:sz="4" w:space="0" w:color="A6A6A6"/>
+              <w:right w:val="single" w:sz="4" w:space="0" w:color="A6A6A6"/>
+            </w:tcBorders>
+          </w:tcPr>
+          <w:p>
+            <w:pPr>
+              <w:spacing w:after="40"/>
+            </w:pPr>
+            <w:r>
+              <w:rPr>
+                <w:rFonts w:ascii="微软雅黑" w:hAnsi="微软雅黑" w:eastAsia="微软雅黑"/>
+                <w:sz w:val="19"/>
+              </w:rPr>
+              <w:t>生成、查询、下载、失效、再归档</w:t>
+            </w:r>
+          </w:p>
+        </w:tc>
+        <w:tc>
+          <w:tcPr>
+            <w:tcW w:type="dxa" w:w="4464"/>
+            <w:vAlign w:val="top"/>
+            <w:tcBorders>
+              <w:top w:val="single" w:sz="4" w:space="0" w:color="A6A6A6"/>
+              <w:left w:val="single" w:sz="4" w:space="0" w:color="A6A6A6"/>
+              <w:bottom w:val="single" w:sz="4" w:space="0" w:color="A6A6A6"/>
+              <w:right w:val="single" w:sz="4" w:space="0" w:color="A6A6A6"/>
+            </w:tcBorders>
+          </w:tcPr>
+          <w:p>
+            <w:pPr>
+              <w:spacing w:after="40"/>
+            </w:pPr>
+            <w:r>
+              <w:rPr>
+                <w:rFonts w:ascii="微软雅黑" w:hAnsi="微软雅黑" w:eastAsia="微软雅黑"/>
+                <w:sz w:val="19"/>
+              </w:rPr>
+              <w:t>形成可交付、可下载、可追溯的批次归档结果。</w:t>
+            </w:r>
+          </w:p>
+        </w:tc>
+      </w:tr>
+    </w:tbl>
+    <w:p/>
+    <w:p>
+      <w:pPr>
+        <w:spacing w:before="160" w:after="80"/>
+        <w:jc w:val="left"/>
+        <w:shd w:fill="1D2330"/>
+      </w:pPr>
+      <w:r>
+        <w:rPr>
+          <w:rFonts w:ascii="微软雅黑" w:hAnsi="微软雅黑" w:eastAsia="微软雅黑"/>
+          <w:b/>
+          <w:color w:val="FFFFFF"/>
+          <w:sz w:val="24"/>
+        </w:rPr>
+        <w:t>2.12 接口分组概要</w:t>
+      </w:r>
+    </w:p>
+    <w:tbl>
+      <w:tblPr>
+        <w:tblStyle w:val="TableGrid"/>
+        <w:tblW w:type="auto" w:w="0"/>
+        <w:jc w:val="center"/>
+        <w:tblLook w:firstColumn="1" w:firstRow="1" w:lastColumn="0" w:lastRow="0" w:noHBand="0" w:noVBand="1" w:val="04A0"/>
+      </w:tblPr>
+      <w:tblGrid>
+        <w:gridCol w:w="2340"/>
+        <w:gridCol w:w="2340"/>
+        <w:gridCol w:w="2340"/>
+        <w:gridCol w:w="2340"/>
+      </w:tblGrid>
+      <w:tr>
+        <w:tc>
+          <w:tcPr>
+            <w:tcW w:type="dxa" w:w="2160"/>
+            <w:shd w:fill="1D2330"/>
+            <w:tcBorders>
+              <w:top w:val="single" w:sz="4" w:space="0" w:color="A6A6A6"/>
+              <w:left w:val="single" w:sz="4" w:space="0" w:color="A6A6A6"/>
+              <w:bottom w:val="single" w:sz="4" w:space="0" w:color="A6A6A6"/>
+              <w:right w:val="single" w:sz="4" w:space="0" w:color="A6A6A6"/>
+            </w:tcBorders>
+          </w:tcPr>
+          <w:p>
+            <w:pPr>
+              <w:jc w:val="center"/>
+            </w:pPr>
+            <w:r>
+              <w:rPr>
+                <w:rFonts w:ascii="微软雅黑" w:hAnsi="微软雅黑" w:eastAsia="微软雅黑"/>
+                <w:b/>
+                <w:color w:val="FFFFFF"/>
+                <w:sz w:val="20"/>
+              </w:rPr>
+              <w:t>接口分组</w:t>
+            </w:r>
+          </w:p>
+        </w:tc>
+        <w:tc>
+          <w:tcPr>
+            <w:tcW w:type="dxa" w:w="3312"/>
+            <w:shd w:fill="1D2330"/>
+            <w:tcBorders>
+              <w:top w:val="single" w:sz="4" w:space="0" w:color="A6A6A6"/>
+              <w:left w:val="single" w:sz="4" w:space="0" w:color="A6A6A6"/>
+              <w:bottom w:val="single" w:sz="4" w:space="0" w:color="A6A6A6"/>
+              <w:right w:val="single" w:sz="4" w:space="0" w:color="A6A6A6"/>
+            </w:tcBorders>
+          </w:tcPr>
+          <w:p>
+            <w:pPr>
+              <w:jc w:val="center"/>
+            </w:pPr>
+            <w:r>
+              <w:rPr>
+                <w:rFonts w:ascii="微软雅黑" w:hAnsi="微软雅黑" w:eastAsia="微软雅黑"/>
+                <w:b/>
+                <w:color w:val="FFFFFF"/>
+                <w:sz w:val="20"/>
+              </w:rPr>
+              <w:t>服务范围</w:t>
+            </w:r>
+          </w:p>
+        </w:tc>
+        <w:tc>
+          <w:tcPr>
+            <w:tcW w:type="dxa" w:w="4320"/>
+            <w:shd w:fill="1D2330"/>
+            <w:tcBorders>
+              <w:top w:val="single" w:sz="4" w:space="0" w:color="A6A6A6"/>
+              <w:left w:val="single" w:sz="4" w:space="0" w:color="A6A6A6"/>
+              <w:bottom w:val="single" w:sz="4" w:space="0" w:color="A6A6A6"/>
+              <w:right w:val="single" w:sz="4" w:space="0" w:color="A6A6A6"/>
+            </w:tcBorders>
+          </w:tcPr>
+          <w:p>
+            <w:pPr>
+              <w:jc w:val="center"/>
+            </w:pPr>
+            <w:r>
+              <w:rPr>
+                <w:rFonts w:ascii="微软雅黑" w:hAnsi="微软雅黑" w:eastAsia="微软雅黑"/>
+                <w:b/>
+                <w:color w:val="FFFFFF"/>
+                <w:sz w:val="20"/>
+              </w:rPr>
+              <w:t>典型能力</w:t>
+            </w:r>
+          </w:p>
+        </w:tc>
+        <w:tc>
+          <w:tcPr>
+            <w:tcW w:type="dxa" w:w="2880"/>
+            <w:shd w:fill="1D2330"/>
+            <w:tcBorders>
+              <w:top w:val="single" w:sz="4" w:space="0" w:color="A6A6A6"/>
+              <w:left w:val="single" w:sz="4" w:space="0" w:color="A6A6A6"/>
+              <w:bottom w:val="single" w:sz="4" w:space="0" w:color="A6A6A6"/>
+              <w:right w:val="single" w:sz="4" w:space="0" w:color="A6A6A6"/>
+            </w:tcBorders>
+          </w:tcPr>
+          <w:p>
+            <w:pPr>
+              <w:jc w:val="center"/>
+            </w:pPr>
+            <w:r>
+              <w:rPr>
+                <w:rFonts w:ascii="微软雅黑" w:hAnsi="微软雅黑" w:eastAsia="微软雅黑"/>
+                <w:b/>
+                <w:color w:val="FFFFFF"/>
+                <w:sz w:val="20"/>
+              </w:rPr>
+              <w:t>调用方</w:t>
+            </w:r>
+          </w:p>
+        </w:tc>
+      </w:tr>
+      <w:tr>
+        <w:tc>
+          <w:tcPr>
+            <w:tcW w:type="dxa" w:w="2160"/>
+            <w:vAlign w:val="top"/>
+            <w:tcBorders>
+              <w:top w:val="single" w:sz="4" w:space="0" w:color="A6A6A6"/>
+              <w:left w:val="single" w:sz="4" w:space="0" w:color="A6A6A6"/>
+              <w:bottom w:val="single" w:sz="4" w:space="0" w:color="A6A6A6"/>
+              <w:right w:val="single" w:sz="4" w:space="0" w:color="A6A6A6"/>
+            </w:tcBorders>
+          </w:tcPr>
+          <w:p>
+            <w:pPr>
+              <w:spacing w:after="40"/>
+            </w:pPr>
+            <w:r>
+              <w:rPr>
+                <w:rFonts w:ascii="微软雅黑" w:hAnsi="微软雅黑" w:eastAsia="微软雅黑"/>
+                <w:sz w:val="19"/>
+              </w:rPr>
+              <w:t>批记录报表接口</w:t>
+            </w:r>
+          </w:p>
+        </w:tc>
+        <w:tc>
+          <w:tcPr>
+            <w:tcW w:type="dxa" w:w="3312"/>
+            <w:vAlign w:val="top"/>
+            <w:tcBorders>
+              <w:top w:val="single" w:sz="4" w:space="0" w:color="A6A6A6"/>
+              <w:left w:val="single" w:sz="4" w:space="0" w:color="A6A6A6"/>
+              <w:bottom w:val="single" w:sz="4" w:space="0" w:color="A6A6A6"/>
+              <w:right w:val="single" w:sz="4" w:space="0" w:color="A6A6A6"/>
+            </w:tcBorders>
+          </w:tcPr>
+          <w:p>
+            <w:pPr>
+              <w:spacing w:after="40"/>
+            </w:pPr>
+            <w:r>
+              <w:rPr>
+                <w:rFonts w:ascii="微软雅黑" w:hAnsi="微软雅黑" w:eastAsia="微软雅黑"/>
+                <w:sz w:val="19"/>
+              </w:rPr>
+              <w:t>模板导入、识别、设计、规则确认、版本治理</w:t>
+            </w:r>
+          </w:p>
+        </w:tc>
+        <w:tc>
+          <w:tcPr>
+            <w:tcW w:type="dxa" w:w="4320"/>
+            <w:vAlign w:val="top"/>
+            <w:tcBorders>
+              <w:top w:val="single" w:sz="4" w:space="0" w:color="A6A6A6"/>
+              <w:left w:val="single" w:sz="4" w:space="0" w:color="A6A6A6"/>
+              <w:bottom w:val="single" w:sz="4" w:space="0" w:color="A6A6A6"/>
+              <w:right w:val="single" w:sz="4" w:space="0" w:color="A6A6A6"/>
+            </w:tcBorders>
+          </w:tcPr>
+          <w:p>
+            <w:pPr>
+              <w:spacing w:after="40"/>
+            </w:pPr>
+            <w:r>
+              <w:rPr>
+                <w:rFonts w:ascii="微软雅黑" w:hAnsi="微软雅黑" w:eastAsia="微软雅黑"/>
+                <w:sz w:val="19"/>
+              </w:rPr>
+              <w:t>上传识别、报表查询、规则维护、版本提交、报表打开</w:t>
+            </w:r>
+          </w:p>
+        </w:tc>
+        <w:tc>
+          <w:tcPr>
+            <w:tcW w:type="dxa" w:w="2880"/>
+            <w:vAlign w:val="top"/>
+            <w:tcBorders>
+              <w:top w:val="single" w:sz="4" w:space="0" w:color="A6A6A6"/>
+              <w:left w:val="single" w:sz="4" w:space="0" w:color="A6A6A6"/>
+              <w:bottom w:val="single" w:sz="4" w:space="0" w:color="A6A6A6"/>
+              <w:right w:val="single" w:sz="4" w:space="0" w:color="A6A6A6"/>
+            </w:tcBorders>
+          </w:tcPr>
+          <w:p>
+            <w:pPr>
+              <w:spacing w:after="40"/>
+            </w:pPr>
+            <w:r>
+              <w:rPr>
+                <w:rFonts w:ascii="微软雅黑" w:hAnsi="微软雅黑" w:eastAsia="微软雅黑"/>
+                <w:sz w:val="19"/>
+              </w:rPr>
+              <w:t>模板管理员、工艺管理员、质量人员</w:t>
+            </w:r>
+          </w:p>
+        </w:tc>
+      </w:tr>
+      <w:tr>
+        <w:tc>
+          <w:tcPr>
+            <w:tcW w:type="dxa" w:w="2160"/>
+            <w:vAlign w:val="top"/>
+            <w:tcBorders>
+              <w:top w:val="single" w:sz="4" w:space="0" w:color="A6A6A6"/>
+              <w:left w:val="single" w:sz="4" w:space="0" w:color="A6A6A6"/>
+              <w:bottom w:val="single" w:sz="4" w:space="0" w:color="A6A6A6"/>
+              <w:right w:val="single" w:sz="4" w:space="0" w:color="A6A6A6"/>
+            </w:tcBorders>
+          </w:tcPr>
+          <w:p>
+            <w:pPr>
+              <w:spacing w:after="40"/>
+            </w:pPr>
+            <w:r>
+              <w:rPr>
+                <w:rFonts w:ascii="微软雅黑" w:hAnsi="微软雅黑" w:eastAsia="微软雅黑"/>
+                <w:sz w:val="19"/>
+              </w:rPr>
+              <w:t>批记录执行接口</w:t>
+            </w:r>
+          </w:p>
+        </w:tc>
+        <w:tc>
+          <w:tcPr>
+            <w:tcW w:type="dxa" w:w="3312"/>
+            <w:vAlign w:val="top"/>
+            <w:tcBorders>
+              <w:top w:val="single" w:sz="4" w:space="0" w:color="A6A6A6"/>
+              <w:left w:val="single" w:sz="4" w:space="0" w:color="A6A6A6"/>
+              <w:bottom w:val="single" w:sz="4" w:space="0" w:color="A6A6A6"/>
+              <w:right w:val="single" w:sz="4" w:space="0" w:color="A6A6A6"/>
+            </w:tcBorders>
+          </w:tcPr>
+          <w:p>
+            <w:pPr>
+              <w:spacing w:after="40"/>
+            </w:pPr>
+            <w:r>
+              <w:rPr>
+                <w:rFonts w:ascii="微软雅黑" w:hAnsi="微软雅黑" w:eastAsia="微软雅黑"/>
+                <w:sz w:val="19"/>
+              </w:rPr>
+              <w:t>传统批记录执行记录与填写结果</w:t>
+            </w:r>
+          </w:p>
+        </w:tc>
+        <w:tc>
+          <w:tcPr>
+            <w:tcW w:type="dxa" w:w="4320"/>
+            <w:vAlign w:val="top"/>
+            <w:tcBorders>
+              <w:top w:val="single" w:sz="4" w:space="0" w:color="A6A6A6"/>
+              <w:left w:val="single" w:sz="4" w:space="0" w:color="A6A6A6"/>
+              <w:bottom w:val="single" w:sz="4" w:space="0" w:color="A6A6A6"/>
+              <w:right w:val="single" w:sz="4" w:space="0" w:color="A6A6A6"/>
+            </w:tcBorders>
+          </w:tcPr>
+          <w:p>
+            <w:pPr>
+              <w:spacing w:after="40"/>
+            </w:pPr>
+            <w:r>
+              <w:rPr>
+                <w:rFonts w:ascii="微软雅黑" w:hAnsi="微软雅黑" w:eastAsia="微软雅黑"/>
+                <w:sz w:val="19"/>
+              </w:rPr>
+              <w:t>打开执行记录、保存草稿、提交、签名、附件、字段审计</w:t>
+            </w:r>
+          </w:p>
+        </w:tc>
+        <w:tc>
+          <w:tcPr>
+            <w:tcW w:type="dxa" w:w="2880"/>
+            <w:vAlign w:val="top"/>
+            <w:tcBorders>
+              <w:top w:val="single" w:sz="4" w:space="0" w:color="A6A6A6"/>
+              <w:left w:val="single" w:sz="4" w:space="0" w:color="A6A6A6"/>
+              <w:bottom w:val="single" w:sz="4" w:space="0" w:color="A6A6A6"/>
+              <w:right w:val="single" w:sz="4" w:space="0" w:color="A6A6A6"/>
+            </w:tcBorders>
+          </w:tcPr>
+          <w:p>
+            <w:pPr>
+              <w:spacing w:after="40"/>
+            </w:pPr>
+            <w:r>
+              <w:rPr>
+                <w:rFonts w:ascii="微软雅黑" w:hAnsi="微软雅黑" w:eastAsia="微软雅黑"/>
+                <w:sz w:val="19"/>
+              </w:rPr>
+              <w:t>批记录填写器、任务详情页</w:t>
+            </w:r>
+          </w:p>
+        </w:tc>
+      </w:tr>
+      <w:tr>
+        <w:tc>
+          <w:tcPr>
+            <w:tcW w:type="dxa" w:w="2160"/>
+            <w:vAlign w:val="top"/>
+            <w:tcBorders>
+              <w:top w:val="single" w:sz="4" w:space="0" w:color="A6A6A6"/>
+              <w:left w:val="single" w:sz="4" w:space="0" w:color="A6A6A6"/>
+              <w:bottom w:val="single" w:sz="4" w:space="0" w:color="A6A6A6"/>
+              <w:right w:val="single" w:sz="4" w:space="0" w:color="A6A6A6"/>
+            </w:tcBorders>
+          </w:tcPr>
+          <w:p>
+            <w:pPr>
+              <w:spacing w:after="40"/>
+            </w:pPr>
+            <w:r>
+              <w:rPr>
+                <w:rFonts w:ascii="微软雅黑" w:hAnsi="微软雅黑" w:eastAsia="微软雅黑"/>
+                <w:sz w:val="19"/>
+              </w:rPr>
+              <w:t>EDHR 批次执行接口</w:t>
+            </w:r>
+          </w:p>
+        </w:tc>
+        <w:tc>
+          <w:tcPr>
+            <w:tcW w:type="dxa" w:w="3312"/>
+            <w:vAlign w:val="top"/>
+            <w:tcBorders>
+              <w:top w:val="single" w:sz="4" w:space="0" w:color="A6A6A6"/>
+              <w:left w:val="single" w:sz="4" w:space="0" w:color="A6A6A6"/>
+              <w:bottom w:val="single" w:sz="4" w:space="0" w:color="A6A6A6"/>
+              <w:right w:val="single" w:sz="4" w:space="0" w:color="A6A6A6"/>
+            </w:tcBorders>
+          </w:tcPr>
+          <w:p>
+            <w:pPr>
+              <w:spacing w:after="40"/>
+            </w:pPr>
+            <w:r>
+              <w:rPr>
+                <w:rFonts w:ascii="微软雅黑" w:hAnsi="微软雅黑" w:eastAsia="微软雅黑"/>
+                <w:sz w:val="19"/>
+              </w:rPr>
+              <w:t>批次级执行对象、批次详情、状态管理</w:t>
+            </w:r>
+          </w:p>
+        </w:tc>
+        <w:tc>
+          <w:tcPr>
+            <w:tcW w:type="dxa" w:w="4320"/>
+            <w:vAlign w:val="top"/>
+            <w:tcBorders>
+              <w:top w:val="single" w:sz="4" w:space="0" w:color="A6A6A6"/>
+              <w:left w:val="single" w:sz="4" w:space="0" w:color="A6A6A6"/>
+              <w:bottom w:val="single" w:sz="4" w:space="0" w:color="A6A6A6"/>
+              <w:right w:val="single" w:sz="4" w:space="0" w:color="A6A6A6"/>
+            </w:tcBorders>
+          </w:tcPr>
+          <w:p>
+            <w:pPr>
+              <w:spacing w:after="40"/>
+            </w:pPr>
+            <w:r>
+              <w:rPr>
+                <w:rFonts w:ascii="微软雅黑" w:hAnsi="微软雅黑" w:eastAsia="微软雅黑"/>
+                <w:sz w:val="19"/>
+              </w:rPr>
+              <w:t>创建批次、打开批次、关闭、驳回、作废、补录、归档</w:t>
+            </w:r>
+          </w:p>
+        </w:tc>
+        <w:tc>
+          <w:tcPr>
+            <w:tcW w:type="dxa" w:w="2880"/>
+            <w:vAlign w:val="top"/>
+            <w:tcBorders>
+              <w:top w:val="single" w:sz="4" w:space="0" w:color="A6A6A6"/>
+              <w:left w:val="single" w:sz="4" w:space="0" w:color="A6A6A6"/>
+              <w:bottom w:val="single" w:sz="4" w:space="0" w:color="A6A6A6"/>
+              <w:right w:val="single" w:sz="4" w:space="0" w:color="A6A6A6"/>
+            </w:tcBorders>
+          </w:tcPr>
+          <w:p>
+            <w:pPr>
+              <w:spacing w:after="40"/>
+            </w:pPr>
+            <w:r>
+              <w:rPr>
+                <w:rFonts w:ascii="微软雅黑" w:hAnsi="微软雅黑" w:eastAsia="微软雅黑"/>
+                <w:sz w:val="19"/>
+              </w:rPr>
+              <w:t>批次列表、批次详情、质量审核</w:t>
+            </w:r>
+          </w:p>
+        </w:tc>
+      </w:tr>
+      <w:tr>
+        <w:tc>
+          <w:tcPr>
+            <w:tcW w:type="dxa" w:w="2160"/>
+            <w:vAlign w:val="top"/>
+            <w:tcBorders>
+              <w:top w:val="single" w:sz="4" w:space="0" w:color="A6A6A6"/>
+              <w:left w:val="single" w:sz="4" w:space="0" w:color="A6A6A6"/>
+              <w:bottom w:val="single" w:sz="4" w:space="0" w:color="A6A6A6"/>
+              <w:right w:val="single" w:sz="4" w:space="0" w:color="A6A6A6"/>
+            </w:tcBorders>
+          </w:tcPr>
+          <w:p>
+            <w:pPr>
+              <w:spacing w:after="40"/>
+            </w:pPr>
+            <w:r>
+              <w:rPr>
+                <w:rFonts w:ascii="微软雅黑" w:hAnsi="微软雅黑" w:eastAsia="微软雅黑"/>
+                <w:sz w:val="19"/>
+              </w:rPr>
+              <w:t>EDHR 工作任务接口</w:t>
+            </w:r>
+          </w:p>
+        </w:tc>
+        <w:tc>
+          <w:tcPr>
+            <w:tcW w:type="dxa" w:w="3312"/>
+            <w:vAlign w:val="top"/>
+            <w:tcBorders>
+              <w:top w:val="single" w:sz="4" w:space="0" w:color="A6A6A6"/>
+              <w:left w:val="single" w:sz="4" w:space="0" w:color="A6A6A6"/>
+              <w:bottom w:val="single" w:sz="4" w:space="0" w:color="A6A6A6"/>
+              <w:right w:val="single" w:sz="4" w:space="0" w:color="A6A6A6"/>
+            </w:tcBorders>
+          </w:tcPr>
+          <w:p>
+            <w:pPr>
+              <w:spacing w:after="40"/>
+            </w:pPr>
+            <w:r>
+              <w:rPr>
+                <w:rFonts w:ascii="微软雅黑" w:hAnsi="微软雅黑" w:eastAsia="微软雅黑"/>
+                <w:sz w:val="19"/>
+              </w:rPr>
+              <w:t>个人待办、任务打开、任务动作、统计</w:t>
+            </w:r>
+          </w:p>
+        </w:tc>
+        <w:tc>
+          <w:tcPr>
+            <w:tcW w:type="dxa" w:w="4320"/>
+            <w:vAlign w:val="top"/>
+            <w:tcBorders>
+              <w:top w:val="single" w:sz="4" w:space="0" w:color="A6A6A6"/>
+              <w:left w:val="single" w:sz="4" w:space="0" w:color="A6A6A6"/>
+              <w:bottom w:val="single" w:sz="4" w:space="0" w:color="A6A6A6"/>
+              <w:right w:val="single" w:sz="4" w:space="0" w:color="A6A6A6"/>
+            </w:tcBorders>
+          </w:tcPr>
+          <w:p>
+            <w:pPr>
+              <w:spacing w:after="40"/>
+            </w:pPr>
+            <w:r>
+              <w:rPr>
+                <w:rFonts w:ascii="微软雅黑" w:hAnsi="微软雅黑" w:eastAsia="微软雅黑"/>
+                <w:sz w:val="19"/>
+              </w:rPr>
+              <w:t>任务分页、任务详情、打开填写、提交、跳过、关闭</w:t>
+            </w:r>
+          </w:p>
+        </w:tc>
+        <w:tc>
+          <w:tcPr>
+            <w:tcW w:type="dxa" w:w="2880"/>
+            <w:vAlign w:val="top"/>
+            <w:tcBorders>
+              <w:top w:val="single" w:sz="4" w:space="0" w:color="A6A6A6"/>
+              <w:left w:val="single" w:sz="4" w:space="0" w:color="A6A6A6"/>
+              <w:bottom w:val="single" w:sz="4" w:space="0" w:color="A6A6A6"/>
+              <w:right w:val="single" w:sz="4" w:space="0" w:color="A6A6A6"/>
+            </w:tcBorders>
+          </w:tcPr>
+          <w:p>
+            <w:pPr>
+              <w:spacing w:after="40"/>
+            </w:pPr>
+            <w:r>
+              <w:rPr>
+                <w:rFonts w:ascii="微软雅黑" w:hAnsi="微软雅黑" w:eastAsia="微软雅黑"/>
+                <w:sz w:val="19"/>
+              </w:rPr>
+              <w:t>个人工作台、批次详情页</w:t>
+            </w:r>
+          </w:p>
+        </w:tc>
+      </w:tr>
+      <w:tr>
+        <w:tc>
+          <w:tcPr>
+            <w:tcW w:type="dxa" w:w="2160"/>
+            <w:vAlign w:val="top"/>
+            <w:tcBorders>
+              <w:top w:val="single" w:sz="4" w:space="0" w:color="A6A6A6"/>
+              <w:left w:val="single" w:sz="4" w:space="0" w:color="A6A6A6"/>
+              <w:bottom w:val="single" w:sz="4" w:space="0" w:color="A6A6A6"/>
+              <w:right w:val="single" w:sz="4" w:space="0" w:color="A6A6A6"/>
+            </w:tcBorders>
+          </w:tcPr>
+          <w:p>
+            <w:pPr>
+              <w:spacing w:after="40"/>
+            </w:pPr>
+            <w:r>
+              <w:rPr>
+                <w:rFonts w:ascii="微软雅黑" w:hAnsi="微软雅黑" w:eastAsia="微软雅黑"/>
+                <w:sz w:val="19"/>
+              </w:rPr>
+              <w:t>变更记录接口</w:t>
+            </w:r>
+          </w:p>
+        </w:tc>
+        <w:tc>
+          <w:tcPr>
+            <w:tcW w:type="dxa" w:w="3312"/>
+            <w:vAlign w:val="top"/>
+            <w:tcBorders>
+              <w:top w:val="single" w:sz="4" w:space="0" w:color="A6A6A6"/>
+              <w:left w:val="single" w:sz="4" w:space="0" w:color="A6A6A6"/>
+              <w:bottom w:val="single" w:sz="4" w:space="0" w:color="A6A6A6"/>
+              <w:right w:val="single" w:sz="4" w:space="0" w:color="A6A6A6"/>
+            </w:tcBorders>
+          </w:tcPr>
+          <w:p>
+            <w:pPr>
+              <w:spacing w:after="40"/>
+            </w:pPr>
+            <w:r>
+              <w:rPr>
+                <w:rFonts w:ascii="微软雅黑" w:hAnsi="微软雅黑" w:eastAsia="微软雅黑"/>
+                <w:sz w:val="19"/>
+              </w:rPr>
+              <w:t>批次变更、作废、重开、补录、审批协同</w:t>
+            </w:r>
+          </w:p>
+        </w:tc>
+        <w:tc>
+          <w:tcPr>
+            <w:tcW w:type="dxa" w:w="4320"/>
+            <w:vAlign w:val="top"/>
+            <w:tcBorders>
+              <w:top w:val="single" w:sz="4" w:space="0" w:color="A6A6A6"/>
+              <w:left w:val="single" w:sz="4" w:space="0" w:color="A6A6A6"/>
+              <w:bottom w:val="single" w:sz="4" w:space="0" w:color="A6A6A6"/>
+              <w:right w:val="single" w:sz="4" w:space="0" w:color="A6A6A6"/>
+            </w:tcBorders>
+          </w:tcPr>
+          <w:p>
+            <w:pPr>
+              <w:spacing w:after="40"/>
+            </w:pPr>
+            <w:r>
+              <w:rPr>
+                <w:rFonts w:ascii="微软雅黑" w:hAnsi="微软雅黑" w:eastAsia="微软雅黑"/>
+                <w:sz w:val="19"/>
+              </w:rPr>
+              <w:t>变更申请、审批状态、影响范围、记录查询</w:t>
+            </w:r>
+          </w:p>
+        </w:tc>
+        <w:tc>
+          <w:tcPr>
+            <w:tcW w:type="dxa" w:w="2880"/>
+            <w:vAlign w:val="top"/>
+            <w:tcBorders>
+              <w:top w:val="single" w:sz="4" w:space="0" w:color="A6A6A6"/>
+              <w:left w:val="single" w:sz="4" w:space="0" w:color="A6A6A6"/>
+              <w:bottom w:val="single" w:sz="4" w:space="0" w:color="A6A6A6"/>
+              <w:right w:val="single" w:sz="4" w:space="0" w:color="A6A6A6"/>
+            </w:tcBorders>
+          </w:tcPr>
+          <w:p>
+            <w:pPr>
+              <w:spacing w:after="40"/>
+            </w:pPr>
+            <w:r>
+              <w:rPr>
+                <w:rFonts w:ascii="微软雅黑" w:hAnsi="微软雅黑" w:eastAsia="微软雅黑"/>
+                <w:sz w:val="19"/>
+              </w:rPr>
+              <w:t>质量人员、生产主管、审批中心</w:t>
+            </w:r>
+          </w:p>
+        </w:tc>
+      </w:tr>
+      <w:tr>
+        <w:tc>
+          <w:tcPr>
+            <w:tcW w:type="dxa" w:w="2160"/>
+            <w:vAlign w:val="top"/>
+            <w:tcBorders>
+              <w:top w:val="single" w:sz="4" w:space="0" w:color="A6A6A6"/>
+              <w:left w:val="single" w:sz="4" w:space="0" w:color="A6A6A6"/>
+              <w:bottom w:val="single" w:sz="4" w:space="0" w:color="A6A6A6"/>
+              <w:right w:val="single" w:sz="4" w:space="0" w:color="A6A6A6"/>
+            </w:tcBorders>
+          </w:tcPr>
+          <w:p>
+            <w:pPr>
+              <w:spacing w:after="40"/>
+            </w:pPr>
+            <w:r>
+              <w:rPr>
+                <w:rFonts w:ascii="微软雅黑" w:hAnsi="微软雅黑" w:eastAsia="微软雅黑"/>
+                <w:sz w:val="19"/>
+              </w:rPr>
+              <w:t>归档追溯接口</w:t>
+            </w:r>
+          </w:p>
+        </w:tc>
+        <w:tc>
+          <w:tcPr>
+            <w:tcW w:type="dxa" w:w="3312"/>
+            <w:vAlign w:val="top"/>
+            <w:tcBorders>
+              <w:top w:val="single" w:sz="4" w:space="0" w:color="A6A6A6"/>
+              <w:left w:val="single" w:sz="4" w:space="0" w:color="A6A6A6"/>
+              <w:bottom w:val="single" w:sz="4" w:space="0" w:color="A6A6A6"/>
+              <w:right w:val="single" w:sz="4" w:space="0" w:color="A6A6A6"/>
+            </w:tcBorders>
+          </w:tcPr>
+          <w:p>
+            <w:pPr>
+              <w:spacing w:after="40"/>
+            </w:pPr>
+            <w:r>
+              <w:rPr>
+                <w:rFonts w:ascii="微软雅黑" w:hAnsi="微软雅黑" w:eastAsia="微软雅黑"/>
+                <w:sz w:val="19"/>
+              </w:rPr>
+              <w:t>归档文件、字段审计、域追溯、操作审计</w:t>
+            </w:r>
+          </w:p>
+        </w:tc>
+        <w:tc>
+          <w:tcPr>
+            <w:tcW w:type="dxa" w:w="4320"/>
+            <w:vAlign w:val="top"/>
+            <w:tcBorders>
+              <w:top w:val="single" w:sz="4" w:space="0" w:color="A6A6A6"/>
+              <w:left w:val="single" w:sz="4" w:space="0" w:color="A6A6A6"/>
+              <w:bottom w:val="single" w:sz="4" w:space="0" w:color="A6A6A6"/>
+              <w:right w:val="single" w:sz="4" w:space="0" w:color="A6A6A6"/>
+            </w:tcBorders>
+          </w:tcPr>
+          <w:p>
+            <w:pPr>
+              <w:spacing w:after="40"/>
+            </w:pPr>
+            <w:r>
+              <w:rPr>
+                <w:rFonts w:ascii="微软雅黑" w:hAnsi="微软雅黑" w:eastAsia="微软雅黑"/>
+                <w:sz w:val="19"/>
+              </w:rPr>
+              <w:t>归档生成、下载、最新归档查询、审计链查询</w:t>
+            </w:r>
+          </w:p>
+        </w:tc>
+        <w:tc>
+          <w:tcPr>
+            <w:tcW w:type="dxa" w:w="2880"/>
+            <w:vAlign w:val="top"/>
+            <w:tcBorders>
+              <w:top w:val="single" w:sz="4" w:space="0" w:color="A6A6A6"/>
+              <w:left w:val="single" w:sz="4" w:space="0" w:color="A6A6A6"/>
+              <w:bottom w:val="single" w:sz="4" w:space="0" w:color="A6A6A6"/>
+              <w:right w:val="single" w:sz="4" w:space="0" w:color="A6A6A6"/>
+            </w:tcBorders>
+          </w:tcPr>
+          <w:p>
+            <w:pPr>
+              <w:spacing w:after="40"/>
+            </w:pPr>
+            <w:r>
+              <w:rPr>
+                <w:rFonts w:ascii="微软雅黑" w:hAnsi="微软雅黑" w:eastAsia="微软雅黑"/>
+                <w:sz w:val="19"/>
+              </w:rPr>
+              <w:t>质量审核、QA、审计人员</w:t>
+            </w:r>
+          </w:p>
+        </w:tc>
+      </w:tr>
+    </w:tbl>
+    <w:p/>
+    <w:p>
+      <w:pPr>
+        <w:spacing w:before="160" w:after="80"/>
+        <w:jc w:val="left"/>
+        <w:shd w:fill="1D2330"/>
+      </w:pPr>
+      <w:r>
+        <w:rPr>
+          <w:rFonts w:ascii="微软雅黑" w:hAnsi="微软雅黑" w:eastAsia="微软雅黑"/>
+          <w:b/>
+          <w:color w:val="FFFFFF"/>
+          <w:sz w:val="24"/>
+        </w:rPr>
+        <w:t>2.13 安全、审计与异常处理概要</w:t>
+      </w:r>
+    </w:p>
+    <w:p>
+      <w:pPr>
+        <w:pStyle w:val="ListBullet"/>
+        <w:spacing w:after="80" w:line="276" w:lineRule="auto"/>
+      </w:pPr>
+      <w:r>
+        <w:rPr>
+          <w:rFonts w:ascii="微软雅黑" w:hAnsi="微软雅黑" w:eastAsia="微软雅黑"/>
+          <w:b w:val="0"/>
+          <w:color w:val="000000"/>
+          <w:sz w:val="21"/>
+        </w:rPr>
+        <w:t>权限控制：按菜单权限、业务角色、任务责任人、候选人和批次状态共同决定可见范围与可操作动作。</w:t>
+      </w:r>
+    </w:p>
+    <w:p>
+      <w:pPr>
+        <w:pStyle w:val="ListBullet"/>
+        <w:spacing w:after="80" w:line="276" w:lineRule="auto"/>
+      </w:pPr>
+      <w:r>
+        <w:rPr>
+          <w:rFonts w:ascii="微软雅黑" w:hAnsi="微软雅黑" w:eastAsia="微软雅黑"/>
+          <w:b w:val="0"/>
+          <w:color w:val="000000"/>
+          <w:sz w:val="21"/>
+        </w:rPr>
+        <w:t>状态保护：关闭、归档、作废、质量驳回等终态或受限状态不得继续进入普通填写路径。</w:t>
+      </w:r>
+    </w:p>
+    <w:p>
+      <w:pPr>
+        <w:pStyle w:val="ListBullet"/>
+        <w:spacing w:after="80" w:line="276" w:lineRule="auto"/>
+      </w:pPr>
+      <w:r>
+        <w:rPr>
+          <w:rFonts w:ascii="微软雅黑" w:hAnsi="微软雅黑" w:eastAsia="微软雅黑"/>
+          <w:b w:val="0"/>
+          <w:color w:val="000000"/>
+          <w:sz w:val="21"/>
+        </w:rPr>
+        <w:t>审计留痕：字段值、签名、附件、提交、驳回、作废、补录和归档均需形成可查询记录。</w:t>
+      </w:r>
+    </w:p>
+    <w:p>
+      <w:pPr>
+        <w:pStyle w:val="ListBullet"/>
+        <w:spacing w:after="80" w:line="276" w:lineRule="auto"/>
+      </w:pPr>
+      <w:r>
+        <w:rPr>
+          <w:rFonts w:ascii="微软雅黑" w:hAnsi="微软雅黑" w:eastAsia="微软雅黑"/>
+          <w:b w:val="0"/>
+          <w:color w:val="000000"/>
+          <w:sz w:val="21"/>
+        </w:rPr>
+        <w:t>异常处理：正式绑定缺失、配置归属错误、快照不一致、任务责任不匹配、归档缺少依据等场景应明确阻断并提示。</w:t>
+      </w:r>
+    </w:p>
+    <w:p>
+      <w:pPr>
+        <w:pStyle w:val="ListBullet"/>
+        <w:spacing w:after="80" w:line="276" w:lineRule="auto"/>
+      </w:pPr>
+      <w:r>
+        <w:rPr>
+          <w:rFonts w:ascii="微软雅黑" w:hAnsi="微软雅黑" w:eastAsia="微软雅黑"/>
+          <w:b w:val="0"/>
+          <w:color w:val="000000"/>
+          <w:sz w:val="21"/>
+        </w:rPr>
+        <w:t>数据一致性：批次执行、工作任务、填写结果、审计记录和归档记录需保持同一批次上下文。</w:t>
+      </w:r>
+    </w:p>
+    <w:tbl>
+      <w:tblPr>
+        <w:tblStyle w:val="TableGrid"/>
+        <w:tblW w:type="auto" w:w="0"/>
+        <w:jc w:val="center"/>
+        <w:tblLook w:firstColumn="1" w:firstRow="1" w:lastColumn="0" w:lastRow="0" w:noHBand="0" w:noVBand="1" w:val="04A0"/>
+      </w:tblPr>
+      <w:tblGrid>
+        <w:gridCol w:w="2340"/>
+        <w:gridCol w:w="2340"/>
+        <w:gridCol w:w="2340"/>
+        <w:gridCol w:w="2340"/>
+      </w:tblGrid>
+      <w:tr>
+        <w:tc>
+          <w:tcPr>
+            <w:tcW w:type="dxa" w:w="1872"/>
+            <w:shd w:fill="1D2330"/>
+            <w:tcBorders>
+              <w:top w:val="single" w:sz="4" w:space="0" w:color="A6A6A6"/>
+              <w:left w:val="single" w:sz="4" w:space="0" w:color="A6A6A6"/>
+              <w:bottom w:val="single" w:sz="4" w:space="0" w:color="A6A6A6"/>
+              <w:right w:val="single" w:sz="4" w:space="0" w:color="A6A6A6"/>
+            </w:tcBorders>
+          </w:tcPr>
+          <w:p>
+            <w:pPr>
+              <w:jc w:val="center"/>
+            </w:pPr>
+            <w:r>
+              <w:rPr>
+                <w:rFonts w:ascii="微软雅黑" w:hAnsi="微软雅黑" w:eastAsia="微软雅黑"/>
+                <w:b/>
+                <w:color w:val="FFFFFF"/>
+                <w:sz w:val="20"/>
+              </w:rPr>
+              <w:t>异常分类</w:t>
+            </w:r>
+          </w:p>
+        </w:tc>
+        <w:tc>
+          <w:tcPr>
+            <w:tcW w:type="dxa" w:w="3888"/>
+            <w:shd w:fill="1D2330"/>
+            <w:tcBorders>
+              <w:top w:val="single" w:sz="4" w:space="0" w:color="A6A6A6"/>
+              <w:left w:val="single" w:sz="4" w:space="0" w:color="A6A6A6"/>
+              <w:bottom w:val="single" w:sz="4" w:space="0" w:color="A6A6A6"/>
+              <w:right w:val="single" w:sz="4" w:space="0" w:color="A6A6A6"/>
+            </w:tcBorders>
+          </w:tcPr>
+          <w:p>
+            <w:pPr>
+              <w:jc w:val="center"/>
+            </w:pPr>
+            <w:r>
+              <w:rPr>
+                <w:rFonts w:ascii="微软雅黑" w:hAnsi="微软雅黑" w:eastAsia="微软雅黑"/>
+                <w:b/>
+                <w:color w:val="FFFFFF"/>
+                <w:sz w:val="20"/>
+              </w:rPr>
+              <w:t>概要处理方式</w:t>
+            </w:r>
+          </w:p>
+        </w:tc>
+        <w:tc>
+          <w:tcPr>
+            <w:tcW w:type="dxa" w:w="2880"/>
+            <w:shd w:fill="1D2330"/>
+            <w:tcBorders>
+              <w:top w:val="single" w:sz="4" w:space="0" w:color="A6A6A6"/>
+              <w:left w:val="single" w:sz="4" w:space="0" w:color="A6A6A6"/>
+              <w:bottom w:val="single" w:sz="4" w:space="0" w:color="A6A6A6"/>
+              <w:right w:val="single" w:sz="4" w:space="0" w:color="A6A6A6"/>
+            </w:tcBorders>
+          </w:tcPr>
+          <w:p>
+            <w:pPr>
+              <w:jc w:val="center"/>
+            </w:pPr>
+            <w:r>
+              <w:rPr>
+                <w:rFonts w:ascii="微软雅黑" w:hAnsi="微软雅黑" w:eastAsia="微软雅黑"/>
+                <w:b/>
+                <w:color w:val="FFFFFF"/>
+                <w:sz w:val="20"/>
+              </w:rPr>
+              <w:t>用户呈现</w:t>
+            </w:r>
+          </w:p>
+        </w:tc>
+        <w:tc>
+          <w:tcPr>
+            <w:tcW w:type="dxa" w:w="4032"/>
+            <w:shd w:fill="1D2330"/>
+            <w:tcBorders>
+              <w:top w:val="single" w:sz="4" w:space="0" w:color="A6A6A6"/>
+              <w:left w:val="single" w:sz="4" w:space="0" w:color="A6A6A6"/>
+              <w:bottom w:val="single" w:sz="4" w:space="0" w:color="A6A6A6"/>
+              <w:right w:val="single" w:sz="4" w:space="0" w:color="A6A6A6"/>
+            </w:tcBorders>
+          </w:tcPr>
+          <w:p>
+            <w:pPr>
+              <w:jc w:val="center"/>
+            </w:pPr>
+            <w:r>
+              <w:rPr>
+                <w:rFonts w:ascii="微软雅黑" w:hAnsi="微软雅黑" w:eastAsia="微软雅黑"/>
+                <w:b/>
+                <w:color w:val="FFFFFF"/>
+                <w:sz w:val="20"/>
+              </w:rPr>
+              <w:t>后续处理</w:t>
+            </w:r>
+          </w:p>
+        </w:tc>
+      </w:tr>
+      <w:tr>
+        <w:tc>
+          <w:tcPr>
+            <w:tcW w:type="dxa" w:w="1872"/>
+            <w:vAlign w:val="top"/>
+            <w:tcBorders>
+              <w:top w:val="single" w:sz="4" w:space="0" w:color="A6A6A6"/>
+              <w:left w:val="single" w:sz="4" w:space="0" w:color="A6A6A6"/>
+              <w:bottom w:val="single" w:sz="4" w:space="0" w:color="A6A6A6"/>
+              <w:right w:val="single" w:sz="4" w:space="0" w:color="A6A6A6"/>
+            </w:tcBorders>
+          </w:tcPr>
+          <w:p>
+            <w:pPr>
+              <w:spacing w:after="40"/>
+            </w:pPr>
+            <w:r>
+              <w:rPr>
+                <w:rFonts w:ascii="微软雅黑" w:hAnsi="微软雅黑" w:eastAsia="微软雅黑"/>
+                <w:sz w:val="19"/>
+              </w:rPr>
+              <w:t>配置异常</w:t>
+            </w:r>
+          </w:p>
+        </w:tc>
+        <w:tc>
+          <w:tcPr>
+            <w:tcW w:type="dxa" w:w="3888"/>
+            <w:vAlign w:val="top"/>
+            <w:tcBorders>
+              <w:top w:val="single" w:sz="4" w:space="0" w:color="A6A6A6"/>
+              <w:left w:val="single" w:sz="4" w:space="0" w:color="A6A6A6"/>
+              <w:bottom w:val="single" w:sz="4" w:space="0" w:color="A6A6A6"/>
+              <w:right w:val="single" w:sz="4" w:space="0" w:color="A6A6A6"/>
+            </w:tcBorders>
+          </w:tcPr>
+          <w:p>
+            <w:pPr>
+              <w:spacing w:after="40"/>
+            </w:pPr>
+            <w:r>
+              <w:rPr>
+                <w:rFonts w:ascii="微软雅黑" w:hAnsi="微软雅黑" w:eastAsia="微软雅黑"/>
+                <w:sz w:val="19"/>
+              </w:rPr>
+              <w:t>阻断批次创建或任务打开，提示缺失或错误配置项。</w:t>
+            </w:r>
+          </w:p>
+        </w:tc>
+        <w:tc>
+          <w:tcPr>
+            <w:tcW w:type="dxa" w:w="2880"/>
+            <w:vAlign w:val="top"/>
+            <w:tcBorders>
+              <w:top w:val="single" w:sz="4" w:space="0" w:color="A6A6A6"/>
+              <w:left w:val="single" w:sz="4" w:space="0" w:color="A6A6A6"/>
+              <w:bottom w:val="single" w:sz="4" w:space="0" w:color="A6A6A6"/>
+              <w:right w:val="single" w:sz="4" w:space="0" w:color="A6A6A6"/>
+            </w:tcBorders>
+          </w:tcPr>
+          <w:p>
+            <w:pPr>
+              <w:spacing w:after="40"/>
+            </w:pPr>
+            <w:r>
+              <w:rPr>
+                <w:rFonts w:ascii="微软雅黑" w:hAnsi="微软雅黑" w:eastAsia="微软雅黑"/>
+                <w:sz w:val="19"/>
+              </w:rPr>
+              <w:t>显示明确业务提示，不返回默认成功。</w:t>
+            </w:r>
+          </w:p>
+        </w:tc>
+        <w:tc>
+          <w:tcPr>
+            <w:tcW w:type="dxa" w:w="4032"/>
+            <w:vAlign w:val="top"/>
+            <w:tcBorders>
+              <w:top w:val="single" w:sz="4" w:space="0" w:color="A6A6A6"/>
+              <w:left w:val="single" w:sz="4" w:space="0" w:color="A6A6A6"/>
+              <w:bottom w:val="single" w:sz="4" w:space="0" w:color="A6A6A6"/>
+              <w:right w:val="single" w:sz="4" w:space="0" w:color="A6A6A6"/>
+            </w:tcBorders>
+          </w:tcPr>
+          <w:p>
+            <w:pPr>
+              <w:spacing w:after="40"/>
+            </w:pPr>
+            <w:r>
+              <w:rPr>
+                <w:rFonts w:ascii="微软雅黑" w:hAnsi="微软雅黑" w:eastAsia="微软雅黑"/>
+                <w:sz w:val="19"/>
+              </w:rPr>
+              <w:t>由工艺或模板管理员修正配置后重新执行。</w:t>
+            </w:r>
+          </w:p>
+        </w:tc>
+      </w:tr>
+      <w:tr>
+        <w:tc>
+          <w:tcPr>
+            <w:tcW w:type="dxa" w:w="1872"/>
+            <w:vAlign w:val="top"/>
+            <w:tcBorders>
+              <w:top w:val="single" w:sz="4" w:space="0" w:color="A6A6A6"/>
+              <w:left w:val="single" w:sz="4" w:space="0" w:color="A6A6A6"/>
+              <w:bottom w:val="single" w:sz="4" w:space="0" w:color="A6A6A6"/>
+              <w:right w:val="single" w:sz="4" w:space="0" w:color="A6A6A6"/>
+            </w:tcBorders>
+          </w:tcPr>
+          <w:p>
+            <w:pPr>
+              <w:spacing w:after="40"/>
+            </w:pPr>
+            <w:r>
+              <w:rPr>
+                <w:rFonts w:ascii="微软雅黑" w:hAnsi="微软雅黑" w:eastAsia="微软雅黑"/>
+                <w:sz w:val="19"/>
+              </w:rPr>
+              <w:t>权限异常</w:t>
+            </w:r>
+          </w:p>
+        </w:tc>
+        <w:tc>
+          <w:tcPr>
+            <w:tcW w:type="dxa" w:w="3888"/>
+            <w:vAlign w:val="top"/>
+            <w:tcBorders>
+              <w:top w:val="single" w:sz="4" w:space="0" w:color="A6A6A6"/>
+              <w:left w:val="single" w:sz="4" w:space="0" w:color="A6A6A6"/>
+              <w:bottom w:val="single" w:sz="4" w:space="0" w:color="A6A6A6"/>
+              <w:right w:val="single" w:sz="4" w:space="0" w:color="A6A6A6"/>
+            </w:tcBorders>
+          </w:tcPr>
+          <w:p>
+            <w:pPr>
+              <w:spacing w:after="40"/>
+            </w:pPr>
+            <w:r>
+              <w:rPr>
+                <w:rFonts w:ascii="微软雅黑" w:hAnsi="微软雅黑" w:eastAsia="微软雅黑"/>
+                <w:sz w:val="19"/>
+              </w:rPr>
+              <w:t>拒绝越权查看或操作，保留访问审计。</w:t>
+            </w:r>
+          </w:p>
+        </w:tc>
+        <w:tc>
+          <w:tcPr>
+            <w:tcW w:type="dxa" w:w="2880"/>
+            <w:vAlign w:val="top"/>
+            <w:tcBorders>
+              <w:top w:val="single" w:sz="4" w:space="0" w:color="A6A6A6"/>
+              <w:left w:val="single" w:sz="4" w:space="0" w:color="A6A6A6"/>
+              <w:bottom w:val="single" w:sz="4" w:space="0" w:color="A6A6A6"/>
+              <w:right w:val="single" w:sz="4" w:space="0" w:color="A6A6A6"/>
+            </w:tcBorders>
+          </w:tcPr>
+          <w:p>
+            <w:pPr>
+              <w:spacing w:after="40"/>
+            </w:pPr>
+            <w:r>
+              <w:rPr>
+                <w:rFonts w:ascii="微软雅黑" w:hAnsi="微软雅黑" w:eastAsia="微软雅黑"/>
+                <w:sz w:val="19"/>
+              </w:rPr>
+              <w:t>提示无权限或无任务责任。</w:t>
+            </w:r>
+          </w:p>
+        </w:tc>
+        <w:tc>
+          <w:tcPr>
+            <w:tcW w:type="dxa" w:w="4032"/>
+            <w:vAlign w:val="top"/>
+            <w:tcBorders>
+              <w:top w:val="single" w:sz="4" w:space="0" w:color="A6A6A6"/>
+              <w:left w:val="single" w:sz="4" w:space="0" w:color="A6A6A6"/>
+              <w:bottom w:val="single" w:sz="4" w:space="0" w:color="A6A6A6"/>
+              <w:right w:val="single" w:sz="4" w:space="0" w:color="A6A6A6"/>
+            </w:tcBorders>
+          </w:tcPr>
+          <w:p>
+            <w:pPr>
+              <w:spacing w:after="40"/>
+            </w:pPr>
+            <w:r>
+              <w:rPr>
+                <w:rFonts w:ascii="微软雅黑" w:hAnsi="微软雅黑" w:eastAsia="微软雅黑"/>
+                <w:sz w:val="19"/>
+              </w:rPr>
+              <w:t>由权限管理员或任务负责人调整授权。</w:t>
+            </w:r>
+          </w:p>
+        </w:tc>
+      </w:tr>
+      <w:tr>
+        <w:tc>
+          <w:tcPr>
+            <w:tcW w:type="dxa" w:w="1872"/>
+            <w:vAlign w:val="top"/>
+            <w:tcBorders>
+              <w:top w:val="single" w:sz="4" w:space="0" w:color="A6A6A6"/>
+              <w:left w:val="single" w:sz="4" w:space="0" w:color="A6A6A6"/>
+              <w:bottom w:val="single" w:sz="4" w:space="0" w:color="A6A6A6"/>
+              <w:right w:val="single" w:sz="4" w:space="0" w:color="A6A6A6"/>
+            </w:tcBorders>
+          </w:tcPr>
+          <w:p>
+            <w:pPr>
+              <w:spacing w:after="40"/>
+            </w:pPr>
+            <w:r>
+              <w:rPr>
+                <w:rFonts w:ascii="微软雅黑" w:hAnsi="微软雅黑" w:eastAsia="微软雅黑"/>
+                <w:sz w:val="19"/>
+              </w:rPr>
+              <w:t>状态异常</w:t>
+            </w:r>
+          </w:p>
+        </w:tc>
+        <w:tc>
+          <w:tcPr>
+            <w:tcW w:type="dxa" w:w="3888"/>
+            <w:vAlign w:val="top"/>
+            <w:tcBorders>
+              <w:top w:val="single" w:sz="4" w:space="0" w:color="A6A6A6"/>
+              <w:left w:val="single" w:sz="4" w:space="0" w:color="A6A6A6"/>
+              <w:bottom w:val="single" w:sz="4" w:space="0" w:color="A6A6A6"/>
+              <w:right w:val="single" w:sz="4" w:space="0" w:color="A6A6A6"/>
+            </w:tcBorders>
+          </w:tcPr>
+          <w:p>
+            <w:pPr>
+              <w:spacing w:after="40"/>
+            </w:pPr>
+            <w:r>
+              <w:rPr>
+                <w:rFonts w:ascii="微软雅黑" w:hAnsi="微软雅黑" w:eastAsia="微软雅黑"/>
+                <w:sz w:val="19"/>
+              </w:rPr>
+              <w:t>阻断终态批次继续填写，允许只读追溯。</w:t>
+            </w:r>
+          </w:p>
+        </w:tc>
+        <w:tc>
+          <w:tcPr>
+            <w:tcW w:type="dxa" w:w="2880"/>
+            <w:vAlign w:val="top"/>
+            <w:tcBorders>
+              <w:top w:val="single" w:sz="4" w:space="0" w:color="A6A6A6"/>
+              <w:left w:val="single" w:sz="4" w:space="0" w:color="A6A6A6"/>
+              <w:bottom w:val="single" w:sz="4" w:space="0" w:color="A6A6A6"/>
+              <w:right w:val="single" w:sz="4" w:space="0" w:color="A6A6A6"/>
+            </w:tcBorders>
+          </w:tcPr>
+          <w:p>
+            <w:pPr>
+              <w:spacing w:after="40"/>
+            </w:pPr>
+            <w:r>
+              <w:rPr>
+                <w:rFonts w:ascii="微软雅黑" w:hAnsi="微软雅黑" w:eastAsia="微软雅黑"/>
+                <w:sz w:val="19"/>
+              </w:rPr>
+              <w:t>提示当前状态不允许该操作。</w:t>
+            </w:r>
+          </w:p>
+        </w:tc>
+        <w:tc>
+          <w:tcPr>
+            <w:tcW w:type="dxa" w:w="4032"/>
+            <w:vAlign w:val="top"/>
+            <w:tcBorders>
+              <w:top w:val="single" w:sz="4" w:space="0" w:color="A6A6A6"/>
+              <w:left w:val="single" w:sz="4" w:space="0" w:color="A6A6A6"/>
+              <w:bottom w:val="single" w:sz="4" w:space="0" w:color="A6A6A6"/>
+              <w:right w:val="single" w:sz="4" w:space="0" w:color="A6A6A6"/>
+            </w:tcBorders>
+          </w:tcPr>
+          <w:p>
+            <w:pPr>
+              <w:spacing w:after="40"/>
+            </w:pPr>
+            <w:r>
+              <w:rPr>
+                <w:rFonts w:ascii="微软雅黑" w:hAnsi="微软雅黑" w:eastAsia="微软雅黑"/>
+                <w:sz w:val="19"/>
+              </w:rPr>
+              <w:t>按质量流程执行重开、补录或变更。</w:t>
+            </w:r>
+          </w:p>
+        </w:tc>
+      </w:tr>
+      <w:tr>
+        <w:tc>
+          <w:tcPr>
+            <w:tcW w:type="dxa" w:w="1872"/>
+            <w:vAlign w:val="top"/>
+            <w:tcBorders>
+              <w:top w:val="single" w:sz="4" w:space="0" w:color="A6A6A6"/>
+              <w:left w:val="single" w:sz="4" w:space="0" w:color="A6A6A6"/>
+              <w:bottom w:val="single" w:sz="4" w:space="0" w:color="A6A6A6"/>
+              <w:right w:val="single" w:sz="4" w:space="0" w:color="A6A6A6"/>
+            </w:tcBorders>
+          </w:tcPr>
+          <w:p>
+            <w:pPr>
+              <w:spacing w:after="40"/>
+            </w:pPr>
+            <w:r>
+              <w:rPr>
+                <w:rFonts w:ascii="微软雅黑" w:hAnsi="微软雅黑" w:eastAsia="微软雅黑"/>
+                <w:sz w:val="19"/>
+              </w:rPr>
+              <w:t>审计异常</w:t>
+            </w:r>
+          </w:p>
+        </w:tc>
+        <w:tc>
+          <w:tcPr>
+            <w:tcW w:type="dxa" w:w="3888"/>
+            <w:vAlign w:val="top"/>
+            <w:tcBorders>
+              <w:top w:val="single" w:sz="4" w:space="0" w:color="A6A6A6"/>
+              <w:left w:val="single" w:sz="4" w:space="0" w:color="A6A6A6"/>
+              <w:bottom w:val="single" w:sz="4" w:space="0" w:color="A6A6A6"/>
+              <w:right w:val="single" w:sz="4" w:space="0" w:color="A6A6A6"/>
+            </w:tcBorders>
+          </w:tcPr>
+          <w:p>
+            <w:pPr>
+              <w:spacing w:after="40"/>
+            </w:pPr>
+            <w:r>
+              <w:rPr>
+                <w:rFonts w:ascii="微软雅黑" w:hAnsi="微软雅黑" w:eastAsia="微软雅黑"/>
+                <w:sz w:val="19"/>
+              </w:rPr>
+              <w:t>阻断提交或归档，避免形成不完整记录。</w:t>
+            </w:r>
+          </w:p>
+        </w:tc>
+        <w:tc>
+          <w:tcPr>
+            <w:tcW w:type="dxa" w:w="2880"/>
+            <w:vAlign w:val="top"/>
+            <w:tcBorders>
+              <w:top w:val="single" w:sz="4" w:space="0" w:color="A6A6A6"/>
+              <w:left w:val="single" w:sz="4" w:space="0" w:color="A6A6A6"/>
+              <w:bottom w:val="single" w:sz="4" w:space="0" w:color="A6A6A6"/>
+              <w:right w:val="single" w:sz="4" w:space="0" w:color="A6A6A6"/>
+            </w:tcBorders>
+          </w:tcPr>
+          <w:p>
+            <w:pPr>
+              <w:spacing w:after="40"/>
+            </w:pPr>
+            <w:r>
+              <w:rPr>
+                <w:rFonts w:ascii="微软雅黑" w:hAnsi="微软雅黑" w:eastAsia="微软雅黑"/>
+                <w:sz w:val="19"/>
+              </w:rPr>
+              <w:t>提示审计证据不完整。</w:t>
+            </w:r>
+          </w:p>
+        </w:tc>
+        <w:tc>
+          <w:tcPr>
+            <w:tcW w:type="dxa" w:w="4032"/>
+            <w:vAlign w:val="top"/>
+            <w:tcBorders>
+              <w:top w:val="single" w:sz="4" w:space="0" w:color="A6A6A6"/>
+              <w:left w:val="single" w:sz="4" w:space="0" w:color="A6A6A6"/>
+              <w:bottom w:val="single" w:sz="4" w:space="0" w:color="A6A6A6"/>
+              <w:right w:val="single" w:sz="4" w:space="0" w:color="A6A6A6"/>
+            </w:tcBorders>
+          </w:tcPr>
+          <w:p>
+            <w:pPr>
+              <w:spacing w:after="40"/>
+            </w:pPr>
+            <w:r>
+              <w:rPr>
+                <w:rFonts w:ascii="微软雅黑" w:hAnsi="微软雅黑" w:eastAsia="微软雅黑"/>
+                <w:sz w:val="19"/>
+              </w:rPr>
+              <w:t>补齐字段审计、签名或附件依据。</w:t>
+            </w:r>
+          </w:p>
+        </w:tc>
+      </w:tr>
+      <w:tr>
+        <w:tc>
+          <w:tcPr>
+            <w:tcW w:type="dxa" w:w="1872"/>
+            <w:vAlign w:val="top"/>
+            <w:tcBorders>
+              <w:top w:val="single" w:sz="4" w:space="0" w:color="A6A6A6"/>
+              <w:left w:val="single" w:sz="4" w:space="0" w:color="A6A6A6"/>
+              <w:bottom w:val="single" w:sz="4" w:space="0" w:color="A6A6A6"/>
+              <w:right w:val="single" w:sz="4" w:space="0" w:color="A6A6A6"/>
+            </w:tcBorders>
+          </w:tcPr>
+          <w:p>
+            <w:pPr>
+              <w:spacing w:after="40"/>
+            </w:pPr>
+            <w:r>
+              <w:rPr>
+                <w:rFonts w:ascii="微软雅黑" w:hAnsi="微软雅黑" w:eastAsia="微软雅黑"/>
+                <w:sz w:val="19"/>
+              </w:rPr>
+              <w:t>归档异常</w:t>
+            </w:r>
+          </w:p>
+        </w:tc>
+        <w:tc>
+          <w:tcPr>
+            <w:tcW w:type="dxa" w:w="3888"/>
+            <w:vAlign w:val="top"/>
+            <w:tcBorders>
+              <w:top w:val="single" w:sz="4" w:space="0" w:color="A6A6A6"/>
+              <w:left w:val="single" w:sz="4" w:space="0" w:color="A6A6A6"/>
+              <w:bottom w:val="single" w:sz="4" w:space="0" w:color="A6A6A6"/>
+              <w:right w:val="single" w:sz="4" w:space="0" w:color="A6A6A6"/>
+            </w:tcBorders>
+          </w:tcPr>
+          <w:p>
+            <w:pPr>
+              <w:spacing w:after="40"/>
+            </w:pPr>
+            <w:r>
+              <w:rPr>
+                <w:rFonts w:ascii="微软雅黑" w:hAnsi="微软雅黑" w:eastAsia="微软雅黑"/>
+                <w:sz w:val="19"/>
+              </w:rPr>
+              <w:t>阻断归档成功状态，保留失败原因。</w:t>
+            </w:r>
+          </w:p>
+        </w:tc>
+        <w:tc>
+          <w:tcPr>
+            <w:tcW w:type="dxa" w:w="2880"/>
+            <w:vAlign w:val="top"/>
+            <w:tcBorders>
+              <w:top w:val="single" w:sz="4" w:space="0" w:color="A6A6A6"/>
+              <w:left w:val="single" w:sz="4" w:space="0" w:color="A6A6A6"/>
+              <w:bottom w:val="single" w:sz="4" w:space="0" w:color="A6A6A6"/>
+              <w:right w:val="single" w:sz="4" w:space="0" w:color="A6A6A6"/>
+            </w:tcBorders>
+          </w:tcPr>
+          <w:p>
+            <w:pPr>
+              <w:spacing w:after="40"/>
+            </w:pPr>
+            <w:r>
+              <w:rPr>
+                <w:rFonts w:ascii="微软雅黑" w:hAnsi="微软雅黑" w:eastAsia="微软雅黑"/>
+                <w:sz w:val="19"/>
+              </w:rPr>
+              <w:t>提示归档失败及原因。</w:t>
+            </w:r>
+          </w:p>
+        </w:tc>
+        <w:tc>
+          <w:tcPr>
+            <w:tcW w:type="dxa" w:w="4032"/>
+            <w:vAlign w:val="top"/>
+            <w:tcBorders>
+              <w:top w:val="single" w:sz="4" w:space="0" w:color="A6A6A6"/>
+              <w:left w:val="single" w:sz="4" w:space="0" w:color="A6A6A6"/>
+              <w:bottom w:val="single" w:sz="4" w:space="0" w:color="A6A6A6"/>
+              <w:right w:val="single" w:sz="4" w:space="0" w:color="A6A6A6"/>
+            </w:tcBorders>
+          </w:tcPr>
+          <w:p>
+            <w:pPr>
+              <w:spacing w:after="40"/>
+            </w:pPr>
+            <w:r>
+              <w:rPr>
+                <w:rFonts w:ascii="微软雅黑" w:hAnsi="微软雅黑" w:eastAsia="微软雅黑"/>
+                <w:sz w:val="19"/>
+              </w:rPr>
+              <w:t>修正模板、附件或记录后重新归档。</w:t>
+            </w:r>
+          </w:p>
+        </w:tc>
+      </w:tr>
+    </w:tbl>
+    <w:p/>
+    <w:p>
+      <w:pPr>
+        <w:spacing w:before="160" w:after="80"/>
+        <w:jc w:val="left"/>
+        <w:shd w:fill="1D2330"/>
+      </w:pPr>
+      <w:r>
+        <w:rPr>
+          <w:rFonts w:ascii="微软雅黑" w:hAnsi="微软雅黑" w:eastAsia="微软雅黑"/>
+          <w:b/>
+          <w:color w:val="FFFFFF"/>
+          <w:sz w:val="24"/>
+        </w:rPr>
+        <w:t>2.14 概要验收边界</w:t>
+      </w:r>
+    </w:p>
+    <w:tbl>
+      <w:tblPr>
+        <w:tblStyle w:val="TableGrid"/>
+        <w:tblW w:type="auto" w:w="0"/>
+        <w:jc w:val="center"/>
+        <w:tblLook w:firstColumn="1" w:firstRow="1" w:lastColumn="0" w:lastRow="0" w:noHBand="0" w:noVBand="1" w:val="04A0"/>
+      </w:tblPr>
+      <w:tblGrid>
+        <w:gridCol w:w="3120"/>
+        <w:gridCol w:w="3120"/>
+        <w:gridCol w:w="3120"/>
+      </w:tblGrid>
+      <w:tr>
+        <w:tc>
+          <w:tcPr>
+            <w:tcW w:type="dxa" w:w="2016"/>
+            <w:shd w:fill="1D2330"/>
+            <w:tcBorders>
+              <w:top w:val="single" w:sz="4" w:space="0" w:color="A6A6A6"/>
+              <w:left w:val="single" w:sz="4" w:space="0" w:color="A6A6A6"/>
+              <w:bottom w:val="single" w:sz="4" w:space="0" w:color="A6A6A6"/>
+              <w:right w:val="single" w:sz="4" w:space="0" w:color="A6A6A6"/>
+            </w:tcBorders>
+          </w:tcPr>
+          <w:p>
+            <w:pPr>
+              <w:jc w:val="center"/>
+            </w:pPr>
+            <w:r>
+              <w:rPr>
+                <w:rFonts w:ascii="微软雅黑" w:hAnsi="微软雅黑" w:eastAsia="微软雅黑"/>
+                <w:b/>
+                <w:color w:val="FFFFFF"/>
+                <w:sz w:val="20"/>
+              </w:rPr>
+              <w:t>验收类别</w:t>
+            </w:r>
+          </w:p>
+        </w:tc>
+        <w:tc>
+          <w:tcPr>
+            <w:tcW w:type="dxa" w:w="5760"/>
+            <w:shd w:fill="1D2330"/>
+            <w:tcBorders>
+              <w:top w:val="single" w:sz="4" w:space="0" w:color="A6A6A6"/>
+              <w:left w:val="single" w:sz="4" w:space="0" w:color="A6A6A6"/>
+              <w:bottom w:val="single" w:sz="4" w:space="0" w:color="A6A6A6"/>
+              <w:right w:val="single" w:sz="4" w:space="0" w:color="A6A6A6"/>
+            </w:tcBorders>
+          </w:tcPr>
+          <w:p>
+            <w:pPr>
+              <w:jc w:val="center"/>
+            </w:pPr>
+            <w:r>
+              <w:rPr>
+                <w:rFonts w:ascii="微软雅黑" w:hAnsi="微软雅黑" w:eastAsia="微软雅黑"/>
+                <w:b/>
+                <w:color w:val="FFFFFF"/>
+                <w:sz w:val="20"/>
+              </w:rPr>
+              <w:t>概要验收点</w:t>
+            </w:r>
+          </w:p>
+        </w:tc>
+        <w:tc>
+          <w:tcPr>
+            <w:tcW w:type="dxa" w:w="5040"/>
+            <w:shd w:fill="1D2330"/>
+            <w:tcBorders>
+              <w:top w:val="single" w:sz="4" w:space="0" w:color="A6A6A6"/>
+              <w:left w:val="single" w:sz="4" w:space="0" w:color="A6A6A6"/>
+              <w:bottom w:val="single" w:sz="4" w:space="0" w:color="A6A6A6"/>
+              <w:right w:val="single" w:sz="4" w:space="0" w:color="A6A6A6"/>
+            </w:tcBorders>
+          </w:tcPr>
+          <w:p>
+            <w:pPr>
+              <w:jc w:val="center"/>
+            </w:pPr>
+            <w:r>
+              <w:rPr>
+                <w:rFonts w:ascii="微软雅黑" w:hAnsi="微软雅黑" w:eastAsia="微软雅黑"/>
+                <w:b/>
+                <w:color w:val="FFFFFF"/>
+                <w:sz w:val="20"/>
+              </w:rPr>
+              <w:t>通过标准</w:t>
+            </w:r>
+          </w:p>
+        </w:tc>
+      </w:tr>
+      <w:tr>
+        <w:tc>
+          <w:tcPr>
+            <w:tcW w:type="dxa" w:w="2016"/>
+            <w:vAlign w:val="top"/>
+            <w:tcBorders>
+              <w:top w:val="single" w:sz="4" w:space="0" w:color="A6A6A6"/>
+              <w:left w:val="single" w:sz="4" w:space="0" w:color="A6A6A6"/>
+              <w:bottom w:val="single" w:sz="4" w:space="0" w:color="A6A6A6"/>
+              <w:right w:val="single" w:sz="4" w:space="0" w:color="A6A6A6"/>
+            </w:tcBorders>
+          </w:tcPr>
+          <w:p>
+            <w:pPr>
+              <w:spacing w:after="40"/>
+            </w:pPr>
+            <w:r>
+              <w:rPr>
+                <w:rFonts w:ascii="微软雅黑" w:hAnsi="微软雅黑" w:eastAsia="微软雅黑"/>
+                <w:sz w:val="19"/>
+              </w:rPr>
+              <w:t>业务范围</w:t>
+            </w:r>
+          </w:p>
+        </w:tc>
+        <w:tc>
+          <w:tcPr>
+            <w:tcW w:type="dxa" w:w="5760"/>
+            <w:vAlign w:val="top"/>
+            <w:tcBorders>
+              <w:top w:val="single" w:sz="4" w:space="0" w:color="A6A6A6"/>
+              <w:left w:val="single" w:sz="4" w:space="0" w:color="A6A6A6"/>
+              <w:bottom w:val="single" w:sz="4" w:space="0" w:color="A6A6A6"/>
+              <w:right w:val="single" w:sz="4" w:space="0" w:color="A6A6A6"/>
+            </w:tcBorders>
+          </w:tcPr>
+          <w:p>
+            <w:pPr>
+              <w:spacing w:after="40"/>
+            </w:pPr>
+            <w:r>
+              <w:rPr>
+                <w:rFonts w:ascii="微软雅黑" w:hAnsi="微软雅黑" w:eastAsia="微软雅黑"/>
+                <w:sz w:val="19"/>
+              </w:rPr>
+              <w:t>批记录模板、路线绑定、批次执行、工作任务、填写审计、归档追溯均纳入。</w:t>
+            </w:r>
+          </w:p>
+        </w:tc>
+        <w:tc>
+          <w:tcPr>
+            <w:tcW w:type="dxa" w:w="5040"/>
+            <w:vAlign w:val="top"/>
+            <w:tcBorders>
+              <w:top w:val="single" w:sz="4" w:space="0" w:color="A6A6A6"/>
+              <w:left w:val="single" w:sz="4" w:space="0" w:color="A6A6A6"/>
+              <w:bottom w:val="single" w:sz="4" w:space="0" w:color="A6A6A6"/>
+              <w:right w:val="single" w:sz="4" w:space="0" w:color="A6A6A6"/>
+            </w:tcBorders>
+          </w:tcPr>
+          <w:p>
+            <w:pPr>
+              <w:spacing w:after="40"/>
+            </w:pPr>
+            <w:r>
+              <w:rPr>
+                <w:rFonts w:ascii="微软雅黑" w:hAnsi="微软雅黑" w:eastAsia="微软雅黑"/>
+                <w:sz w:val="19"/>
+              </w:rPr>
+              <w:t>需求范围与模块划分一致，无遗漏核心业务链路。</w:t>
+            </w:r>
+          </w:p>
+        </w:tc>
+      </w:tr>
+      <w:tr>
+        <w:tc>
+          <w:tcPr>
+            <w:tcW w:type="dxa" w:w="2016"/>
+            <w:vAlign w:val="top"/>
+            <w:tcBorders>
+              <w:top w:val="single" w:sz="4" w:space="0" w:color="A6A6A6"/>
+              <w:left w:val="single" w:sz="4" w:space="0" w:color="A6A6A6"/>
+              <w:bottom w:val="single" w:sz="4" w:space="0" w:color="A6A6A6"/>
+              <w:right w:val="single" w:sz="4" w:space="0" w:color="A6A6A6"/>
+            </w:tcBorders>
+          </w:tcPr>
+          <w:p>
+            <w:pPr>
+              <w:spacing w:after="40"/>
+            </w:pPr>
+            <w:r>
+              <w:rPr>
+                <w:rFonts w:ascii="微软雅黑" w:hAnsi="微软雅黑" w:eastAsia="微软雅黑"/>
+                <w:sz w:val="19"/>
+              </w:rPr>
+              <w:t>配置边界</w:t>
+            </w:r>
+          </w:p>
+        </w:tc>
+        <w:tc>
+          <w:tcPr>
+            <w:tcW w:type="dxa" w:w="5760"/>
+            <w:vAlign w:val="top"/>
+            <w:tcBorders>
+              <w:top w:val="single" w:sz="4" w:space="0" w:color="A6A6A6"/>
+              <w:left w:val="single" w:sz="4" w:space="0" w:color="A6A6A6"/>
+              <w:bottom w:val="single" w:sz="4" w:space="0" w:color="A6A6A6"/>
+              <w:right w:val="single" w:sz="4" w:space="0" w:color="A6A6A6"/>
+            </w:tcBorders>
+          </w:tcPr>
+          <w:p>
+            <w:pPr>
+              <w:spacing w:after="40"/>
+            </w:pPr>
+            <w:r>
+              <w:rPr>
+                <w:rFonts w:ascii="微软雅黑" w:hAnsi="微软雅黑" w:eastAsia="微软雅黑"/>
+                <w:sz w:val="19"/>
+              </w:rPr>
+              <w:t>批记录表单、表单槽位、工序开始三类配置独立表达。</w:t>
+            </w:r>
+          </w:p>
+        </w:tc>
+        <w:tc>
+          <w:tcPr>
+            <w:tcW w:type="dxa" w:w="5040"/>
+            <w:vAlign w:val="top"/>
+            <w:tcBorders>
+              <w:top w:val="single" w:sz="4" w:space="0" w:color="A6A6A6"/>
+              <w:left w:val="single" w:sz="4" w:space="0" w:color="A6A6A6"/>
+              <w:bottom w:val="single" w:sz="4" w:space="0" w:color="A6A6A6"/>
+              <w:right w:val="single" w:sz="4" w:space="0" w:color="A6A6A6"/>
+            </w:tcBorders>
+          </w:tcPr>
+          <w:p>
+            <w:pPr>
+              <w:spacing w:after="40"/>
+            </w:pPr>
+            <w:r>
+              <w:rPr>
+                <w:rFonts w:ascii="微软雅黑" w:hAnsi="微软雅黑" w:eastAsia="微软雅黑"/>
+                <w:sz w:val="19"/>
+              </w:rPr>
+              <w:t>任一页面、接口或报表不得混用三类配置来源。</w:t>
+            </w:r>
+          </w:p>
+        </w:tc>
+      </w:tr>
+      <w:tr>
+        <w:tc>
+          <w:tcPr>
+            <w:tcW w:type="dxa" w:w="2016"/>
+            <w:vAlign w:val="top"/>
+            <w:tcBorders>
+              <w:top w:val="single" w:sz="4" w:space="0" w:color="A6A6A6"/>
+              <w:left w:val="single" w:sz="4" w:space="0" w:color="A6A6A6"/>
+              <w:bottom w:val="single" w:sz="4" w:space="0" w:color="A6A6A6"/>
+              <w:right w:val="single" w:sz="4" w:space="0" w:color="A6A6A6"/>
+            </w:tcBorders>
+          </w:tcPr>
+          <w:p>
+            <w:pPr>
+              <w:spacing w:after="40"/>
+            </w:pPr>
+            <w:r>
+              <w:rPr>
+                <w:rFonts w:ascii="微软雅黑" w:hAnsi="微软雅黑" w:eastAsia="微软雅黑"/>
+                <w:sz w:val="19"/>
+              </w:rPr>
+              <w:t>流程完整性</w:t>
+            </w:r>
+          </w:p>
+        </w:tc>
+        <w:tc>
+          <w:tcPr>
+            <w:tcW w:type="dxa" w:w="5760"/>
+            <w:vAlign w:val="top"/>
+            <w:tcBorders>
+              <w:top w:val="single" w:sz="4" w:space="0" w:color="A6A6A6"/>
+              <w:left w:val="single" w:sz="4" w:space="0" w:color="A6A6A6"/>
+              <w:bottom w:val="single" w:sz="4" w:space="0" w:color="A6A6A6"/>
+              <w:right w:val="single" w:sz="4" w:space="0" w:color="A6A6A6"/>
+            </w:tcBorders>
+          </w:tcPr>
+          <w:p>
+            <w:pPr>
+              <w:spacing w:after="40"/>
+            </w:pPr>
+            <w:r>
+              <w:rPr>
+                <w:rFonts w:ascii="微软雅黑" w:hAnsi="微软雅黑" w:eastAsia="微软雅黑"/>
+                <w:sz w:val="19"/>
+              </w:rPr>
+              <w:t>从模板发布到批次归档形成闭环。</w:t>
+            </w:r>
+          </w:p>
+        </w:tc>
+        <w:tc>
+          <w:tcPr>
+            <w:tcW w:type="dxa" w:w="5040"/>
+            <w:vAlign w:val="top"/>
+            <w:tcBorders>
+              <w:top w:val="single" w:sz="4" w:space="0" w:color="A6A6A6"/>
+              <w:left w:val="single" w:sz="4" w:space="0" w:color="A6A6A6"/>
+              <w:bottom w:val="single" w:sz="4" w:space="0" w:color="A6A6A6"/>
+              <w:right w:val="single" w:sz="4" w:space="0" w:color="A6A6A6"/>
+            </w:tcBorders>
+          </w:tcPr>
+          <w:p>
+            <w:pPr>
+              <w:spacing w:after="40"/>
+            </w:pPr>
+            <w:r>
+              <w:rPr>
+                <w:rFonts w:ascii="微软雅黑" w:hAnsi="微软雅黑" w:eastAsia="微软雅黑"/>
+                <w:sz w:val="19"/>
+              </w:rPr>
+              <w:t>每个主流程均有输入、输出、状态变化和异常处理。</w:t>
+            </w:r>
+          </w:p>
+        </w:tc>
+      </w:tr>
+      <w:tr>
+        <w:tc>
+          <w:tcPr>
+            <w:tcW w:type="dxa" w:w="2016"/>
+            <w:vAlign w:val="top"/>
+            <w:tcBorders>
+              <w:top w:val="single" w:sz="4" w:space="0" w:color="A6A6A6"/>
+              <w:left w:val="single" w:sz="4" w:space="0" w:color="A6A6A6"/>
+              <w:bottom w:val="single" w:sz="4" w:space="0" w:color="A6A6A6"/>
+              <w:right w:val="single" w:sz="4" w:space="0" w:color="A6A6A6"/>
+            </w:tcBorders>
+          </w:tcPr>
+          <w:p>
+            <w:pPr>
+              <w:spacing w:after="40"/>
+            </w:pPr>
+            <w:r>
+              <w:rPr>
+                <w:rFonts w:ascii="微软雅黑" w:hAnsi="微软雅黑" w:eastAsia="微软雅黑"/>
+                <w:sz w:val="19"/>
+              </w:rPr>
+              <w:t>数据一致性</w:t>
+            </w:r>
+          </w:p>
+        </w:tc>
+        <w:tc>
+          <w:tcPr>
+            <w:tcW w:type="dxa" w:w="5760"/>
+            <w:vAlign w:val="top"/>
+            <w:tcBorders>
+              <w:top w:val="single" w:sz="4" w:space="0" w:color="A6A6A6"/>
+              <w:left w:val="single" w:sz="4" w:space="0" w:color="A6A6A6"/>
+              <w:bottom w:val="single" w:sz="4" w:space="0" w:color="A6A6A6"/>
+              <w:right w:val="single" w:sz="4" w:space="0" w:color="A6A6A6"/>
+            </w:tcBorders>
+          </w:tcPr>
+          <w:p>
+            <w:pPr>
+              <w:spacing w:after="40"/>
+            </w:pPr>
+            <w:r>
+              <w:rPr>
+                <w:rFonts w:ascii="微软雅黑" w:hAnsi="微软雅黑" w:eastAsia="微软雅黑"/>
+                <w:sz w:val="19"/>
+              </w:rPr>
+              <w:t>执行记录、任务、审计、归档按同一批次上下文关联。</w:t>
+            </w:r>
+          </w:p>
+        </w:tc>
+        <w:tc>
+          <w:tcPr>
+            <w:tcW w:type="dxa" w:w="5040"/>
+            <w:vAlign w:val="top"/>
+            <w:tcBorders>
+              <w:top w:val="single" w:sz="4" w:space="0" w:color="A6A6A6"/>
+              <w:left w:val="single" w:sz="4" w:space="0" w:color="A6A6A6"/>
+              <w:bottom w:val="single" w:sz="4" w:space="0" w:color="A6A6A6"/>
+              <w:right w:val="single" w:sz="4" w:space="0" w:color="A6A6A6"/>
+            </w:tcBorders>
+          </w:tcPr>
+          <w:p>
+            <w:pPr>
+              <w:spacing w:after="40"/>
+            </w:pPr>
+            <w:r>
+              <w:rPr>
+                <w:rFonts w:ascii="微软雅黑" w:hAnsi="微软雅黑" w:eastAsia="微软雅黑"/>
+                <w:sz w:val="19"/>
+              </w:rPr>
+              <w:t>查询结果、详情页、归档文件和审计记录互相一致。</w:t>
+            </w:r>
+          </w:p>
+        </w:tc>
+      </w:tr>
+      <w:tr>
+        <w:tc>
+          <w:tcPr>
+            <w:tcW w:type="dxa" w:w="2016"/>
+            <w:vAlign w:val="top"/>
+            <w:tcBorders>
+              <w:top w:val="single" w:sz="4" w:space="0" w:color="A6A6A6"/>
+              <w:left w:val="single" w:sz="4" w:space="0" w:color="A6A6A6"/>
+              <w:bottom w:val="single" w:sz="4" w:space="0" w:color="A6A6A6"/>
+              <w:right w:val="single" w:sz="4" w:space="0" w:color="A6A6A6"/>
+            </w:tcBorders>
+          </w:tcPr>
+          <w:p>
+            <w:pPr>
+              <w:spacing w:after="40"/>
+            </w:pPr>
+            <w:r>
+              <w:rPr>
+                <w:rFonts w:ascii="微软雅黑" w:hAnsi="微软雅黑" w:eastAsia="微软雅黑"/>
+                <w:sz w:val="19"/>
+              </w:rPr>
+              <w:t>交付可维护性</w:t>
+            </w:r>
+          </w:p>
+        </w:tc>
+        <w:tc>
+          <w:tcPr>
+            <w:tcW w:type="dxa" w:w="5760"/>
+            <w:vAlign w:val="top"/>
+            <w:tcBorders>
+              <w:top w:val="single" w:sz="4" w:space="0" w:color="A6A6A6"/>
+              <w:left w:val="single" w:sz="4" w:space="0" w:color="A6A6A6"/>
+              <w:bottom w:val="single" w:sz="4" w:space="0" w:color="A6A6A6"/>
+              <w:right w:val="single" w:sz="4" w:space="0" w:color="A6A6A6"/>
+            </w:tcBorders>
+          </w:tcPr>
+          <w:p>
+            <w:pPr>
+              <w:spacing w:after="40"/>
+            </w:pPr>
+            <w:r>
+              <w:rPr>
+                <w:rFonts w:ascii="微软雅黑" w:hAnsi="微软雅黑" w:eastAsia="微软雅黑"/>
+                <w:sz w:val="19"/>
+              </w:rPr>
+              <w:t>模块职责清晰，接口分组清晰，异常口径清晰。</w:t>
+            </w:r>
+          </w:p>
+        </w:tc>
+        <w:tc>
+          <w:tcPr>
+            <w:tcW w:type="dxa" w:w="5040"/>
+            <w:vAlign w:val="top"/>
+            <w:tcBorders>
+              <w:top w:val="single" w:sz="4" w:space="0" w:color="A6A6A6"/>
+              <w:left w:val="single" w:sz="4" w:space="0" w:color="A6A6A6"/>
+              <w:bottom w:val="single" w:sz="4" w:space="0" w:color="A6A6A6"/>
+              <w:right w:val="single" w:sz="4" w:space="0" w:color="A6A6A6"/>
+            </w:tcBorders>
+          </w:tcPr>
+          <w:p>
+            <w:pPr>
+              <w:spacing w:after="40"/>
+            </w:pPr>
+            <w:r>
+              <w:rPr>
+                <w:rFonts w:ascii="微软雅黑" w:hAnsi="微软雅黑" w:eastAsia="微软雅黑"/>
+                <w:sz w:val="19"/>
+              </w:rPr>
+              <w:t>后续详细设计可直接落到接口、服务、数据表和页面组件。</w:t>
+            </w:r>
+          </w:p>
+        </w:tc>
+      </w:tr>
+    </w:tbl>
+    <w:p/>
     <w:sectPr>
       <w:pgSz w:w="12240" w:h="15840"/>
       <w:pgMar w:top="1440" w:right="1440" w:bottom="1440" w:left="1440" w:header="708" w:footer="708" w:gutter="0"/>

</xml_diff>